<commit_message>
update footers in files
Changed 498 to 484
</commit_message>
<xml_diff>
--- a/Advanced-Digital-Design/howTo/howTo 00 Install Xilinx Vitas.docx
+++ b/Advanced-Digital-Design/howTo/howTo 00 Install Xilinx Vitas.docx
@@ -1,14 +1,9 @@
 
 <file path=word/document.xml><?xml version="1.0" encoding="utf-8"?>
-<w:document xmlns:o="urn:schemas-microsoft-com:office:office" xmlns:r="http://schemas.openxmlformats.org/officeDocument/2006/relationships" xmlns:v="urn:schemas-microsoft-com:vml" xmlns:w="http://schemas.openxmlformats.org/wordprocessingml/2006/main" xmlns:w10="urn:schemas-microsoft-com:office:word" xmlns:wp="http://schemas.openxmlformats.org/drawingml/2006/wordprocessingDrawing" xmlns:pic="http://schemas.openxmlformats.org/drawingml/2006/picture" xmlns:wps="http://schemas.microsoft.com/office/word/2010/wordprocessingShape" xmlns:wpg="http://schemas.microsoft.com/office/word/2010/wordprocessingGroup" xmlns:mc="http://schemas.openxmlformats.org/markup-compatibility/2006" xmlns:wp14="http://schemas.microsoft.com/office/word/2010/wordprocessingDrawing" xmlns:w14="http://schemas.microsoft.com/office/word/2010/wordml" xmlns:w15="http://schemas.microsoft.com/office/word/2012/wordml" mc:Ignorable="w14 wp14 w15">
+<w:document xmlns:wpc="http://schemas.microsoft.com/office/word/2010/wordprocessingCanvas" xmlns:cx="http://schemas.microsoft.com/office/drawing/2014/chartex" xmlns:cx1="http://schemas.microsoft.com/office/drawing/2015/9/8/chartex" xmlns:cx2="http://schemas.microsoft.com/office/drawing/2015/10/21/chartex" xmlns:cx3="http://schemas.microsoft.com/office/drawing/2016/5/9/chartex" xmlns:cx4="http://schemas.microsoft.com/office/drawing/2016/5/10/chartex" xmlns:cx5="http://schemas.microsoft.com/office/drawing/2016/5/11/chartex" xmlns:cx6="http://schemas.microsoft.com/office/drawing/2016/5/12/chartex" xmlns:cx7="http://schemas.microsoft.com/office/drawing/2016/5/13/chartex" xmlns:cx8="http://schemas.microsoft.com/office/drawing/2016/5/14/chartex" xmlns:mc="http://schemas.openxmlformats.org/markup-compatibility/2006" xmlns:aink="http://schemas.microsoft.com/office/drawing/2016/ink" xmlns:am3d="http://schemas.microsoft.com/office/drawing/2017/model3d" xmlns:o="urn:schemas-microsoft-com:office:office" xmlns:oel="http://schemas.microsoft.com/office/2019/extlst" xmlns:r="http://schemas.openxmlformats.org/officeDocument/2006/relationships" xmlns:m="http://schemas.openxmlformats.org/officeDocument/2006/math" xmlns:v="urn:schemas-microsoft-com:vml" xmlns:wp14="http://schemas.microsoft.com/office/word/2010/wordprocessingDrawing" xmlns:wp="http://schemas.openxmlformats.org/drawingml/2006/wordprocessingDrawing" xmlns:w10="urn:schemas-microsoft-com:office:word" xmlns:w="http://schemas.openxmlformats.org/wordprocessingml/2006/main" xmlns:w14="http://schemas.microsoft.com/office/word/2010/wordml" xmlns:w15="http://schemas.microsoft.com/office/word/2012/wordml" xmlns:w16cex="http://schemas.microsoft.com/office/word/2018/wordml/cex" xmlns:w16cid="http://schemas.microsoft.com/office/word/2016/wordml/cid" xmlns:w16="http://schemas.microsoft.com/office/word/2018/wordml" xmlns:w16du="http://schemas.microsoft.com/office/word/2023/wordml/word16du" xmlns:w16sdtdh="http://schemas.microsoft.com/office/word/2020/wordml/sdtdatahash" xmlns:w16sdtfl="http://schemas.microsoft.com/office/word/2024/wordml/sdtformatlock" xmlns:w16se="http://schemas.microsoft.com/office/word/2015/wordml/symex" xmlns:wpg="http://schemas.microsoft.com/office/word/2010/wordprocessingGroup" xmlns:wpi="http://schemas.microsoft.com/office/word/2010/wordprocessingInk" xmlns:wne="http://schemas.microsoft.com/office/word/2006/wordml" xmlns:wps="http://schemas.microsoft.com/office/word/2010/wordprocessingShape" mc:Ignorable="w14 w15 w16se w16cid w16 w16cex w16sdtdh w16sdtfl w16du wp14">
   <w:body>
     <w:p>
-      <w:pPr>
-        <w:pStyle w:val="Normal"/>
-        <w:rPr/>
-      </w:pPr>
-      <w:r>
-        <w:rPr/>
+      <w:r>
         <w:t>Installation of Xilinx Vitis is time consuming, you will need around 3 hours to start and complete the install, please plan ahead.</w:t>
       </w:r>
     </w:p>
@@ -19,15 +14,12 @@
           <w:ilvl w:val="0"/>
           <w:numId w:val="2"/>
         </w:numPr>
-        <w:spacing w:lineRule="auto" w:line="240" w:before="0" w:after="0"/>
-        <w:contextualSpacing/>
-        <w:rPr/>
-      </w:pPr>
-      <w:r>
-        <w:rPr/>
+        <w:spacing w:after="0" w:line="240" w:lineRule="auto"/>
+      </w:pPr>
+      <w:r>
         <w:t xml:space="preserve">Goto: </w:t>
       </w:r>
-      <w:hyperlink r:id="rId2">
+      <w:hyperlink r:id="rId8">
         <w:r>
           <w:rPr>
             <w:rStyle w:val="Hyperlink"/>
@@ -43,12 +35,9 @@
           <w:ilvl w:val="0"/>
           <w:numId w:val="2"/>
         </w:numPr>
-        <w:spacing w:lineRule="auto" w:line="240" w:before="0" w:after="0"/>
-        <w:contextualSpacing/>
-        <w:rPr/>
-      </w:pPr>
-      <w:r>
-        <w:rPr/>
+        <w:spacing w:after="0" w:line="240" w:lineRule="auto"/>
+      </w:pPr>
+      <w:r>
         <w:t>Click on the Vitis (SW Developer) tab</w:t>
       </w:r>
     </w:p>
@@ -59,19 +48,16 @@
           <w:ilvl w:val="0"/>
           <w:numId w:val="2"/>
         </w:numPr>
-        <w:spacing w:lineRule="auto" w:line="240" w:before="0" w:after="0"/>
-        <w:contextualSpacing/>
-        <w:rPr/>
-      </w:pPr>
-      <w:r>
-        <w:rPr/>
+        <w:spacing w:after="0" w:line="240" w:lineRule="auto"/>
+      </w:pPr>
+      <w:r>
         <w:t>Scroll down and click on the link:</w:t>
       </w:r>
     </w:p>
     <w:p>
       <w:pPr>
         <w:pStyle w:val="ListParagraph"/>
-        <w:ind w:hanging="0" w:left="720"/>
+        <w:ind w:firstLine="0"/>
         <w:rPr>
           <w:sz w:val="16"/>
           <w:szCs w:val="16"/>
@@ -92,12 +78,9 @@
           <w:ilvl w:val="0"/>
           <w:numId w:val="2"/>
         </w:numPr>
-        <w:spacing w:lineRule="auto" w:line="240" w:before="0" w:after="0"/>
-        <w:contextualSpacing/>
-        <w:rPr/>
-      </w:pPr>
-      <w:r>
-        <w:rPr/>
+        <w:spacing w:after="0" w:line="240" w:lineRule="auto"/>
+      </w:pPr>
+      <w:r>
         <w:t>Sign in or create an account and then click red Download</w:t>
       </w:r>
     </w:p>
@@ -108,12 +91,9 @@
           <w:ilvl w:val="0"/>
           <w:numId w:val="2"/>
         </w:numPr>
-        <w:spacing w:lineRule="auto" w:line="240" w:before="0" w:after="0"/>
-        <w:contextualSpacing/>
-        <w:rPr/>
-      </w:pPr>
-      <w:r>
-        <w:rPr/>
+        <w:spacing w:after="0" w:line="240" w:lineRule="auto"/>
+      </w:pPr>
+      <w:r>
         <w:t xml:space="preserve">Open the self-extracting archive </w:t>
       </w:r>
     </w:p>
@@ -124,25 +104,22 @@
           <w:ilvl w:val="1"/>
           <w:numId w:val="2"/>
         </w:numPr>
-        <w:spacing w:lineRule="auto" w:line="240" w:before="0" w:after="0"/>
-        <w:contextualSpacing/>
-        <w:rPr/>
-      </w:pPr>
-      <w:r>
-        <w:rPr/>
+        <w:spacing w:after="0" w:line="240" w:lineRule="auto"/>
+      </w:pPr>
+      <w:r>
         <w:t>Read information on Welcome screen, click Next</w:t>
       </w:r>
     </w:p>
     <w:p>
       <w:pPr>
         <w:pStyle w:val="ListParagraph"/>
-        <w:spacing w:lineRule="auto" w:line="240" w:before="0" w:after="0"/>
-        <w:ind w:hanging="0" w:left="1440"/>
-        <w:contextualSpacing/>
-        <w:rPr/>
-      </w:pPr>
-      <w:r>
-        <w:rPr/>
+        <w:spacing w:after="0" w:line="240" w:lineRule="auto"/>
+        <w:ind w:left="1440" w:firstLine="0"/>
+      </w:pPr>
+      <w:r>
+        <w:rPr>
+          <w:noProof/>
+        </w:rPr>
         <w:drawing>
           <wp:inline distT="0" distB="0" distL="0" distR="0">
             <wp:extent cx="2743200" cy="2099310"/>
@@ -156,464 +133,6 @@
                 <pic:pic xmlns:pic="http://schemas.openxmlformats.org/drawingml/2006/picture">
                   <pic:nvPicPr>
                     <pic:cNvPr id="1" name="Picture 1" descr="A screenshot of a computer&#10;&#10;Description automatically generated"/>
-                    <pic:cNvPicPr>
-                      <a:picLocks noChangeAspect="1" noChangeArrowheads="1"/>
-                    </pic:cNvPicPr>
-                  </pic:nvPicPr>
-                  <pic:blipFill>
-                    <a:blip r:embed="rId3"/>
-                    <a:stretch>
-                      <a:fillRect/>
-                    </a:stretch>
-                  </pic:blipFill>
-                  <pic:spPr bwMode="auto">
-                    <a:xfrm>
-                      <a:off x="0" y="0"/>
-                      <a:ext cx="2743200" cy="2099310"/>
-                    </a:xfrm>
-                    <a:prstGeom prst="rect">
-                      <a:avLst/>
-                    </a:prstGeom>
-                    <a:noFill/>
-                  </pic:spPr>
-                </pic:pic>
-              </a:graphicData>
-            </a:graphic>
-          </wp:inline>
-        </w:drawing>
-      </w:r>
-    </w:p>
-    <w:p>
-      <w:pPr>
-        <w:pStyle w:val="ListParagraph"/>
-        <w:numPr>
-          <w:ilvl w:val="1"/>
-          <w:numId w:val="2"/>
-        </w:numPr>
-        <w:spacing w:lineRule="auto" w:line="240" w:before="0" w:after="0"/>
-        <w:contextualSpacing/>
-        <w:rPr/>
-      </w:pPr>
-      <w:r>
-        <w:rPr/>
-        <w:t>Provide login information (same as used to download software).  Select Download and Install Now radio button.  Click Next.</w:t>
-      </w:r>
-    </w:p>
-    <w:p>
-      <w:pPr>
-        <w:pStyle w:val="ListParagraph"/>
-        <w:spacing w:lineRule="auto" w:line="240" w:before="0" w:after="0"/>
-        <w:ind w:hanging="0" w:left="1440"/>
-        <w:contextualSpacing/>
-        <w:rPr/>
-      </w:pPr>
-      <w:r>
-        <w:rPr/>
-        <w:drawing>
-          <wp:inline distT="0" distB="0" distL="0" distR="0">
-            <wp:extent cx="2743200" cy="2099310"/>
-            <wp:effectExtent l="0" t="0" r="0" b="0"/>
-            <wp:docPr id="2" name="Image2" descr="A screenshot of a computer&#10;&#10;Description automatically generated"/>
-            <wp:cNvGraphicFramePr>
-              <a:graphicFrameLocks xmlns:a="http://schemas.openxmlformats.org/drawingml/2006/main" noChangeAspect="1"/>
-            </wp:cNvGraphicFramePr>
-            <a:graphic xmlns:a="http://schemas.openxmlformats.org/drawingml/2006/main">
-              <a:graphicData uri="http://schemas.openxmlformats.org/drawingml/2006/picture">
-                <pic:pic xmlns:pic="http://schemas.openxmlformats.org/drawingml/2006/picture">
-                  <pic:nvPicPr>
-                    <pic:cNvPr id="2" name="Image2" descr="A screenshot of a computer&#10;&#10;Description automatically generated"/>
-                    <pic:cNvPicPr>
-                      <a:picLocks noChangeAspect="1" noChangeArrowheads="1"/>
-                    </pic:cNvPicPr>
-                  </pic:nvPicPr>
-                  <pic:blipFill>
-                    <a:blip r:embed="rId4"/>
-                    <a:stretch>
-                      <a:fillRect/>
-                    </a:stretch>
-                  </pic:blipFill>
-                  <pic:spPr bwMode="auto">
-                    <a:xfrm>
-                      <a:off x="0" y="0"/>
-                      <a:ext cx="2743200" cy="2099310"/>
-                    </a:xfrm>
-                    <a:prstGeom prst="rect">
-                      <a:avLst/>
-                    </a:prstGeom>
-                    <a:noFill/>
-                  </pic:spPr>
-                </pic:pic>
-              </a:graphicData>
-            </a:graphic>
-          </wp:inline>
-        </w:drawing>
-      </w:r>
-    </w:p>
-    <w:p>
-      <w:pPr>
-        <w:pStyle w:val="ListParagraph"/>
-        <w:spacing w:lineRule="auto" w:line="240" w:before="0" w:after="0"/>
-        <w:ind w:hanging="0" w:left="1440"/>
-        <w:contextualSpacing/>
-        <w:rPr/>
-      </w:pPr>
-      <w:r>
-        <w:rPr/>
-      </w:r>
-    </w:p>
-    <w:p>
-      <w:pPr>
-        <w:pStyle w:val="ListParagraph"/>
-        <w:numPr>
-          <w:ilvl w:val="1"/>
-          <w:numId w:val="2"/>
-        </w:numPr>
-        <w:spacing w:lineRule="auto" w:line="240" w:before="0" w:after="0"/>
-        <w:contextualSpacing/>
-        <w:rPr/>
-      </w:pPr>
-      <w:r>
-        <w:rPr/>
-        <w:t>Product to Install: Vitis - this will automatically install Vivado as well.</w:t>
-      </w:r>
-    </w:p>
-    <w:p>
-      <w:pPr>
-        <w:pStyle w:val="ListParagraph"/>
-        <w:ind w:hanging="10" w:left="1440"/>
-        <w:rPr/>
-      </w:pPr>
-      <w:r>
-        <w:rPr/>
-        <w:drawing>
-          <wp:inline distT="0" distB="0" distL="0" distR="0">
-            <wp:extent cx="2743200" cy="2099310"/>
-            <wp:effectExtent l="0" t="0" r="0" b="0"/>
-            <wp:docPr id="3" name="Image3" descr="A screenshot of a computer&#10;&#10;Description automatically generated"/>
-            <wp:cNvGraphicFramePr>
-              <a:graphicFrameLocks xmlns:a="http://schemas.openxmlformats.org/drawingml/2006/main" noChangeAspect="1"/>
-            </wp:cNvGraphicFramePr>
-            <a:graphic xmlns:a="http://schemas.openxmlformats.org/drawingml/2006/main">
-              <a:graphicData uri="http://schemas.openxmlformats.org/drawingml/2006/picture">
-                <pic:pic xmlns:pic="http://schemas.openxmlformats.org/drawingml/2006/picture">
-                  <pic:nvPicPr>
-                    <pic:cNvPr id="3" name="Image3" descr="A screenshot of a computer&#10;&#10;Description automatically generated"/>
-                    <pic:cNvPicPr>
-                      <a:picLocks noChangeAspect="1" noChangeArrowheads="1"/>
-                    </pic:cNvPicPr>
-                  </pic:nvPicPr>
-                  <pic:blipFill>
-                    <a:blip r:embed="rId5"/>
-                    <a:stretch>
-                      <a:fillRect/>
-                    </a:stretch>
-                  </pic:blipFill>
-                  <pic:spPr bwMode="auto">
-                    <a:xfrm>
-                      <a:off x="0" y="0"/>
-                      <a:ext cx="2743200" cy="2099310"/>
-                    </a:xfrm>
-                    <a:prstGeom prst="rect">
-                      <a:avLst/>
-                    </a:prstGeom>
-                    <a:noFill/>
-                  </pic:spPr>
-                </pic:pic>
-              </a:graphicData>
-            </a:graphic>
-          </wp:inline>
-        </w:drawing>
-      </w:r>
-    </w:p>
-    <w:p>
-      <w:pPr>
-        <w:pStyle w:val="ListParagraph"/>
-        <w:numPr>
-          <w:ilvl w:val="1"/>
-          <w:numId w:val="2"/>
-        </w:numPr>
-        <w:spacing w:lineRule="auto" w:line="240" w:before="0" w:after="0"/>
-        <w:contextualSpacing/>
-        <w:rPr/>
-      </w:pPr>
-      <w:r>
-        <w:rPr/>
-        <w:t>Select the following options:</w:t>
-      </w:r>
-    </w:p>
-    <w:p>
-      <w:pPr>
-        <w:pStyle w:val="Normal"/>
-        <w:ind w:firstLine="720" w:left="720"/>
-        <w:rPr/>
-      </w:pPr>
-      <w:r>
-        <w:rPr/>
-        <w:drawing>
-          <wp:inline distT="0" distB="0" distL="0" distR="0">
-            <wp:extent cx="2743200" cy="2099310"/>
-            <wp:effectExtent l="0" t="0" r="0" b="0"/>
-            <wp:docPr id="4" name="Image4" descr=""/>
-            <wp:cNvGraphicFramePr>
-              <a:graphicFrameLocks xmlns:a="http://schemas.openxmlformats.org/drawingml/2006/main" noChangeAspect="1"/>
-            </wp:cNvGraphicFramePr>
-            <a:graphic xmlns:a="http://schemas.openxmlformats.org/drawingml/2006/main">
-              <a:graphicData uri="http://schemas.openxmlformats.org/drawingml/2006/picture">
-                <pic:pic xmlns:pic="http://schemas.openxmlformats.org/drawingml/2006/picture">
-                  <pic:nvPicPr>
-                    <pic:cNvPr id="4" name="Image4" descr=""/>
-                    <pic:cNvPicPr>
-                      <a:picLocks noChangeAspect="1" noChangeArrowheads="1"/>
-                    </pic:cNvPicPr>
-                  </pic:nvPicPr>
-                  <pic:blipFill>
-                    <a:blip r:embed="rId6"/>
-                    <a:stretch>
-                      <a:fillRect/>
-                    </a:stretch>
-                  </pic:blipFill>
-                  <pic:spPr bwMode="auto">
-                    <a:xfrm>
-                      <a:off x="0" y="0"/>
-                      <a:ext cx="2743200" cy="2099310"/>
-                    </a:xfrm>
-                    <a:prstGeom prst="rect">
-                      <a:avLst/>
-                    </a:prstGeom>
-                    <a:noFill/>
-                  </pic:spPr>
-                </pic:pic>
-              </a:graphicData>
-            </a:graphic>
-          </wp:inline>
-        </w:drawing>
-      </w:r>
-    </w:p>
-    <w:p>
-      <w:pPr>
-        <w:pStyle w:val="ListParagraph"/>
-        <w:ind w:hanging="10" w:left="1440"/>
-        <w:rPr/>
-      </w:pPr>
-      <w:r>
-        <w:rPr/>
-      </w:r>
-    </w:p>
-    <w:p>
-      <w:pPr>
-        <w:pStyle w:val="ListParagraph"/>
-        <w:numPr>
-          <w:ilvl w:val="1"/>
-          <w:numId w:val="2"/>
-        </w:numPr>
-        <w:spacing w:lineRule="auto" w:line="240" w:before="0" w:after="0"/>
-        <w:contextualSpacing/>
-        <w:rPr/>
-      </w:pPr>
-      <w:r>
-        <w:rPr/>
-        <w:t>License Agreements: Scroll down and agree to all of them.</w:t>
-      </w:r>
-    </w:p>
-    <w:p>
-      <w:pPr>
-        <w:pStyle w:val="Normal"/>
-        <w:spacing w:lineRule="auto" w:line="240" w:before="0" w:after="0"/>
-        <w:ind w:hanging="0" w:left="1080"/>
-        <w:rPr/>
-      </w:pPr>
-      <w:r>
-        <w:rPr/>
-        <w:drawing>
-          <wp:inline distT="0" distB="0" distL="0" distR="0">
-            <wp:extent cx="2743200" cy="2099310"/>
-            <wp:effectExtent l="0" t="0" r="0" b="0"/>
-            <wp:docPr id="5" name="Image5" descr="A screenshot of a computer screen&#10;&#10;Description automatically generated with medium confidence"/>
-            <wp:cNvGraphicFramePr>
-              <a:graphicFrameLocks xmlns:a="http://schemas.openxmlformats.org/drawingml/2006/main" noChangeAspect="1"/>
-            </wp:cNvGraphicFramePr>
-            <a:graphic xmlns:a="http://schemas.openxmlformats.org/drawingml/2006/main">
-              <a:graphicData uri="http://schemas.openxmlformats.org/drawingml/2006/picture">
-                <pic:pic xmlns:pic="http://schemas.openxmlformats.org/drawingml/2006/picture">
-                  <pic:nvPicPr>
-                    <pic:cNvPr id="5" name="Image5" descr="A screenshot of a computer screen&#10;&#10;Description automatically generated with medium confidence"/>
-                    <pic:cNvPicPr>
-                      <a:picLocks noChangeAspect="1" noChangeArrowheads="1"/>
-                    </pic:cNvPicPr>
-                  </pic:nvPicPr>
-                  <pic:blipFill>
-                    <a:blip r:embed="rId7"/>
-                    <a:stretch>
-                      <a:fillRect/>
-                    </a:stretch>
-                  </pic:blipFill>
-                  <pic:spPr bwMode="auto">
-                    <a:xfrm>
-                      <a:off x="0" y="0"/>
-                      <a:ext cx="2743200" cy="2099310"/>
-                    </a:xfrm>
-                    <a:prstGeom prst="rect">
-                      <a:avLst/>
-                    </a:prstGeom>
-                    <a:noFill/>
-                  </pic:spPr>
-                </pic:pic>
-              </a:graphicData>
-            </a:graphic>
-          </wp:inline>
-        </w:drawing>
-      </w:r>
-    </w:p>
-    <w:p>
-      <w:pPr>
-        <w:pStyle w:val="Normal"/>
-        <w:spacing w:lineRule="auto" w:line="240" w:before="0" w:after="0"/>
-        <w:ind w:hanging="0" w:left="1080"/>
-        <w:rPr/>
-      </w:pPr>
-      <w:r>
-        <w:rPr/>
-      </w:r>
-    </w:p>
-    <w:p>
-      <w:pPr>
-        <w:pStyle w:val="Normal"/>
-        <w:spacing w:lineRule="auto" w:line="259" w:before="0" w:after="160"/>
-        <w:ind w:hanging="0" w:left="0"/>
-        <w:rPr/>
-      </w:pPr>
-      <w:r>
-        <w:rPr/>
-      </w:r>
-      <w:r>
-        <w:br w:type="page"/>
-      </w:r>
-    </w:p>
-    <w:p>
-      <w:pPr>
-        <w:pStyle w:val="Normal"/>
-        <w:spacing w:lineRule="auto" w:line="240" w:before="0" w:after="0"/>
-        <w:ind w:hanging="0" w:left="0"/>
-        <w:rPr/>
-      </w:pPr>
-      <w:r>
-        <w:rPr/>
-      </w:r>
-    </w:p>
-    <w:p>
-      <w:pPr>
-        <w:pStyle w:val="ListParagraph"/>
-        <w:numPr>
-          <w:ilvl w:val="1"/>
-          <w:numId w:val="2"/>
-        </w:numPr>
-        <w:spacing w:lineRule="auto" w:line="240" w:before="0" w:after="0"/>
-        <w:contextualSpacing/>
-        <w:rPr/>
-      </w:pPr>
-      <w:r>
-        <w:rPr/>
-        <w:t>Put Xilinx in the root directory of your preferred (biggest) drive.</w:t>
-      </w:r>
-    </w:p>
-    <w:p>
-      <w:pPr>
-        <w:pStyle w:val="Normal"/>
-        <w:spacing w:lineRule="auto" w:line="240" w:before="0" w:after="0"/>
-        <w:ind w:hanging="0" w:left="1080"/>
-        <w:rPr/>
-      </w:pPr>
-      <w:r>
-        <w:rPr/>
-        <w:drawing>
-          <wp:inline distT="0" distB="0" distL="0" distR="0">
-            <wp:extent cx="2743200" cy="2099310"/>
-            <wp:effectExtent l="0" t="0" r="0" b="0"/>
-            <wp:docPr id="6" name="Image6" descr="A screenshot of a computer&#10;&#10;Description automatically generated"/>
-            <wp:cNvGraphicFramePr>
-              <a:graphicFrameLocks xmlns:a="http://schemas.openxmlformats.org/drawingml/2006/main" noChangeAspect="1"/>
-            </wp:cNvGraphicFramePr>
-            <a:graphic xmlns:a="http://schemas.openxmlformats.org/drawingml/2006/main">
-              <a:graphicData uri="http://schemas.openxmlformats.org/drawingml/2006/picture">
-                <pic:pic xmlns:pic="http://schemas.openxmlformats.org/drawingml/2006/picture">
-                  <pic:nvPicPr>
-                    <pic:cNvPr id="6" name="Image6" descr="A screenshot of a computer&#10;&#10;Description automatically generated"/>
-                    <pic:cNvPicPr>
-                      <a:picLocks noChangeAspect="1" noChangeArrowheads="1"/>
-                    </pic:cNvPicPr>
-                  </pic:nvPicPr>
-                  <pic:blipFill>
-                    <a:blip r:embed="rId8"/>
-                    <a:stretch>
-                      <a:fillRect/>
-                    </a:stretch>
-                  </pic:blipFill>
-                  <pic:spPr bwMode="auto">
-                    <a:xfrm>
-                      <a:off x="0" y="0"/>
-                      <a:ext cx="2743200" cy="2099310"/>
-                    </a:xfrm>
-                    <a:prstGeom prst="rect">
-                      <a:avLst/>
-                    </a:prstGeom>
-                    <a:noFill/>
-                  </pic:spPr>
-                </pic:pic>
-              </a:graphicData>
-            </a:graphic>
-          </wp:inline>
-        </w:drawing>
-      </w:r>
-    </w:p>
-    <w:p>
-      <w:pPr>
-        <w:pStyle w:val="Normal"/>
-        <w:spacing w:lineRule="auto" w:line="240" w:before="0" w:after="0"/>
-        <w:ind w:hanging="0" w:left="1080"/>
-        <w:rPr/>
-      </w:pPr>
-      <w:r>
-        <w:rPr/>
-      </w:r>
-    </w:p>
-    <w:p>
-      <w:pPr>
-        <w:pStyle w:val="ListParagraph"/>
-        <w:numPr>
-          <w:ilvl w:val="1"/>
-          <w:numId w:val="2"/>
-        </w:numPr>
-        <w:spacing w:lineRule="auto" w:line="240" w:before="0" w:after="0"/>
-        <w:contextualSpacing/>
-        <w:rPr/>
-      </w:pPr>
-      <w:r>
-        <w:rPr/>
-        <w:t>Click Install.</w:t>
-      </w:r>
-    </w:p>
-    <w:p>
-      <w:pPr>
-        <w:pStyle w:val="Normal"/>
-        <w:spacing w:lineRule="auto" w:line="240" w:before="0" w:after="0"/>
-        <w:ind w:hanging="0" w:left="1080"/>
-        <w:rPr/>
-      </w:pPr>
-      <w:r>
-        <w:rPr/>
-        <w:drawing>
-          <wp:inline distT="0" distB="0" distL="0" distR="0">
-            <wp:extent cx="2743200" cy="2099310"/>
-            <wp:effectExtent l="0" t="0" r="0" b="0"/>
-            <wp:docPr id="7" name="Image7" descr="A screenshot of a computer&#10;&#10;Description automatically generated"/>
-            <wp:cNvGraphicFramePr>
-              <a:graphicFrameLocks xmlns:a="http://schemas.openxmlformats.org/drawingml/2006/main" noChangeAspect="1"/>
-            </wp:cNvGraphicFramePr>
-            <a:graphic xmlns:a="http://schemas.openxmlformats.org/drawingml/2006/main">
-              <a:graphicData uri="http://schemas.openxmlformats.org/drawingml/2006/picture">
-                <pic:pic xmlns:pic="http://schemas.openxmlformats.org/drawingml/2006/picture">
-                  <pic:nvPicPr>
-                    <pic:cNvPr id="7" name="Image7" descr="A screenshot of a computer&#10;&#10;Description automatically generated"/>
                     <pic:cNvPicPr>
                       <a:picLocks noChangeAspect="1" noChangeArrowheads="1"/>
                     </pic:cNvPicPr>
@@ -644,43 +163,31 @@
     <w:p>
       <w:pPr>
         <w:pStyle w:val="ListParagraph"/>
-        <w:ind w:hanging="10" w:left="1440"/>
-        <w:rPr/>
-      </w:pPr>
-      <w:r>
-        <w:rPr/>
-        <w:br/>
-      </w:r>
-    </w:p>
-    <w:p>
-      <w:pPr>
-        <w:pStyle w:val="ListParagraph"/>
         <w:numPr>
           <w:ilvl w:val="1"/>
           <w:numId w:val="2"/>
         </w:numPr>
-        <w:spacing w:lineRule="auto" w:line="240" w:before="0" w:after="0"/>
-        <w:contextualSpacing/>
-        <w:rPr/>
-      </w:pPr>
-      <w:r>
-        <w:rPr/>
-        <w:t>A few hours later…</w:t>
+        <w:spacing w:after="0" w:line="240" w:lineRule="auto"/>
+      </w:pPr>
+      <w:r>
+        <w:t>Provide login information (same as used to download software).  Select Download and Install Now radio button.  Click Next.</w:t>
       </w:r>
     </w:p>
     <w:p>
       <w:pPr>
         <w:pStyle w:val="ListParagraph"/>
-        <w:ind w:hanging="10" w:left="1440"/>
-        <w:rPr/>
-      </w:pPr>
-      <w:r>
-        <w:rPr/>
+        <w:spacing w:after="0" w:line="240" w:lineRule="auto"/>
+        <w:ind w:left="1440" w:firstLine="0"/>
+      </w:pPr>
+      <w:r>
+        <w:rPr>
+          <w:noProof/>
+        </w:rPr>
         <w:drawing>
           <wp:inline distT="0" distB="0" distL="0" distR="0">
-            <wp:extent cx="2822575" cy="2160270"/>
+            <wp:extent cx="2743200" cy="2099310"/>
             <wp:effectExtent l="0" t="0" r="0" b="0"/>
-            <wp:docPr id="8" name="Picture 4" descr=""/>
+            <wp:docPr id="2" name="Image2" descr="A screenshot of a computer&#10;&#10;Description automatically generated"/>
             <wp:cNvGraphicFramePr>
               <a:graphicFrameLocks xmlns:a="http://schemas.openxmlformats.org/drawingml/2006/main" noChangeAspect="1"/>
             </wp:cNvGraphicFramePr>
@@ -688,13 +195,442 @@
               <a:graphicData uri="http://schemas.openxmlformats.org/drawingml/2006/picture">
                 <pic:pic xmlns:pic="http://schemas.openxmlformats.org/drawingml/2006/picture">
                   <pic:nvPicPr>
-                    <pic:cNvPr id="8" name="Picture 4" descr=""/>
+                    <pic:cNvPr id="2" name="Image2" descr="A screenshot of a computer&#10;&#10;Description automatically generated"/>
                     <pic:cNvPicPr>
                       <a:picLocks noChangeAspect="1" noChangeArrowheads="1"/>
                     </pic:cNvPicPr>
                   </pic:nvPicPr>
                   <pic:blipFill>
                     <a:blip r:embed="rId10"/>
+                    <a:stretch>
+                      <a:fillRect/>
+                    </a:stretch>
+                  </pic:blipFill>
+                  <pic:spPr bwMode="auto">
+                    <a:xfrm>
+                      <a:off x="0" y="0"/>
+                      <a:ext cx="2743200" cy="2099310"/>
+                    </a:xfrm>
+                    <a:prstGeom prst="rect">
+                      <a:avLst/>
+                    </a:prstGeom>
+                    <a:noFill/>
+                  </pic:spPr>
+                </pic:pic>
+              </a:graphicData>
+            </a:graphic>
+          </wp:inline>
+        </w:drawing>
+      </w:r>
+    </w:p>
+    <w:p>
+      <w:pPr>
+        <w:pStyle w:val="ListParagraph"/>
+        <w:spacing w:after="0" w:line="240" w:lineRule="auto"/>
+        <w:ind w:left="1440" w:firstLine="0"/>
+      </w:pPr>
+    </w:p>
+    <w:p>
+      <w:pPr>
+        <w:pStyle w:val="ListParagraph"/>
+        <w:numPr>
+          <w:ilvl w:val="1"/>
+          <w:numId w:val="2"/>
+        </w:numPr>
+        <w:spacing w:after="0" w:line="240" w:lineRule="auto"/>
+      </w:pPr>
+      <w:r>
+        <w:t xml:space="preserve">Product to Install: Vitis - this will automatically install </w:t>
+      </w:r>
+      <w:proofErr w:type="spellStart"/>
+      <w:r>
+        <w:t>Vivado</w:t>
+      </w:r>
+      <w:proofErr w:type="spellEnd"/>
+      <w:r>
+        <w:t xml:space="preserve"> as well.</w:t>
+      </w:r>
+    </w:p>
+    <w:p>
+      <w:pPr>
+        <w:pStyle w:val="ListParagraph"/>
+        <w:ind w:left="1440"/>
+      </w:pPr>
+      <w:r>
+        <w:rPr>
+          <w:noProof/>
+        </w:rPr>
+        <w:lastRenderedPageBreak/>
+        <w:drawing>
+          <wp:inline distT="0" distB="0" distL="0" distR="0">
+            <wp:extent cx="2743200" cy="2099310"/>
+            <wp:effectExtent l="0" t="0" r="0" b="0"/>
+            <wp:docPr id="3" name="Image3" descr="A screenshot of a computer&#10;&#10;Description automatically generated"/>
+            <wp:cNvGraphicFramePr>
+              <a:graphicFrameLocks xmlns:a="http://schemas.openxmlformats.org/drawingml/2006/main" noChangeAspect="1"/>
+            </wp:cNvGraphicFramePr>
+            <a:graphic xmlns:a="http://schemas.openxmlformats.org/drawingml/2006/main">
+              <a:graphicData uri="http://schemas.openxmlformats.org/drawingml/2006/picture">
+                <pic:pic xmlns:pic="http://schemas.openxmlformats.org/drawingml/2006/picture">
+                  <pic:nvPicPr>
+                    <pic:cNvPr id="3" name="Image3" descr="A screenshot of a computer&#10;&#10;Description automatically generated"/>
+                    <pic:cNvPicPr>
+                      <a:picLocks noChangeAspect="1" noChangeArrowheads="1"/>
+                    </pic:cNvPicPr>
+                  </pic:nvPicPr>
+                  <pic:blipFill>
+                    <a:blip r:embed="rId11"/>
+                    <a:stretch>
+                      <a:fillRect/>
+                    </a:stretch>
+                  </pic:blipFill>
+                  <pic:spPr bwMode="auto">
+                    <a:xfrm>
+                      <a:off x="0" y="0"/>
+                      <a:ext cx="2743200" cy="2099310"/>
+                    </a:xfrm>
+                    <a:prstGeom prst="rect">
+                      <a:avLst/>
+                    </a:prstGeom>
+                    <a:noFill/>
+                  </pic:spPr>
+                </pic:pic>
+              </a:graphicData>
+            </a:graphic>
+          </wp:inline>
+        </w:drawing>
+      </w:r>
+    </w:p>
+    <w:p>
+      <w:pPr>
+        <w:pStyle w:val="ListParagraph"/>
+        <w:numPr>
+          <w:ilvl w:val="1"/>
+          <w:numId w:val="2"/>
+        </w:numPr>
+        <w:spacing w:after="0" w:line="240" w:lineRule="auto"/>
+      </w:pPr>
+      <w:r>
+        <w:t>Select the following options:</w:t>
+      </w:r>
+    </w:p>
+    <w:p>
+      <w:pPr>
+        <w:ind w:left="720" w:firstLine="720"/>
+      </w:pPr>
+      <w:r>
+        <w:rPr>
+          <w:noProof/>
+        </w:rPr>
+        <w:drawing>
+          <wp:inline distT="0" distB="0" distL="0" distR="0">
+            <wp:extent cx="2743200" cy="2099310"/>
+            <wp:effectExtent l="0" t="0" r="0" b="0"/>
+            <wp:docPr id="4" name="Image4"/>
+            <wp:cNvGraphicFramePr>
+              <a:graphicFrameLocks xmlns:a="http://schemas.openxmlformats.org/drawingml/2006/main" noChangeAspect="1"/>
+            </wp:cNvGraphicFramePr>
+            <a:graphic xmlns:a="http://schemas.openxmlformats.org/drawingml/2006/main">
+              <a:graphicData uri="http://schemas.openxmlformats.org/drawingml/2006/picture">
+                <pic:pic xmlns:pic="http://schemas.openxmlformats.org/drawingml/2006/picture">
+                  <pic:nvPicPr>
+                    <pic:cNvPr id="4" name="Image4"/>
+                    <pic:cNvPicPr>
+                      <a:picLocks noChangeAspect="1" noChangeArrowheads="1"/>
+                    </pic:cNvPicPr>
+                  </pic:nvPicPr>
+                  <pic:blipFill>
+                    <a:blip r:embed="rId12"/>
+                    <a:stretch>
+                      <a:fillRect/>
+                    </a:stretch>
+                  </pic:blipFill>
+                  <pic:spPr bwMode="auto">
+                    <a:xfrm>
+                      <a:off x="0" y="0"/>
+                      <a:ext cx="2743200" cy="2099310"/>
+                    </a:xfrm>
+                    <a:prstGeom prst="rect">
+                      <a:avLst/>
+                    </a:prstGeom>
+                    <a:noFill/>
+                  </pic:spPr>
+                </pic:pic>
+              </a:graphicData>
+            </a:graphic>
+          </wp:inline>
+        </w:drawing>
+      </w:r>
+    </w:p>
+    <w:p>
+      <w:pPr>
+        <w:pStyle w:val="ListParagraph"/>
+        <w:ind w:left="1440"/>
+      </w:pPr>
+    </w:p>
+    <w:p>
+      <w:pPr>
+        <w:pStyle w:val="ListParagraph"/>
+        <w:numPr>
+          <w:ilvl w:val="1"/>
+          <w:numId w:val="2"/>
+        </w:numPr>
+        <w:spacing w:after="0" w:line="240" w:lineRule="auto"/>
+      </w:pPr>
+      <w:r>
+        <w:t>License Agreements: Scroll down and agree to all of them.</w:t>
+      </w:r>
+    </w:p>
+    <w:p>
+      <w:pPr>
+        <w:spacing w:after="0" w:line="240" w:lineRule="auto"/>
+        <w:ind w:left="1080" w:firstLine="0"/>
+      </w:pPr>
+      <w:r>
+        <w:rPr>
+          <w:noProof/>
+        </w:rPr>
+        <w:drawing>
+          <wp:inline distT="0" distB="0" distL="0" distR="0">
+            <wp:extent cx="2743200" cy="2099310"/>
+            <wp:effectExtent l="0" t="0" r="0" b="0"/>
+            <wp:docPr id="5" name="Image5" descr="A screenshot of a computer screen&#10;&#10;Description automatically generated with medium confidence"/>
+            <wp:cNvGraphicFramePr>
+              <a:graphicFrameLocks xmlns:a="http://schemas.openxmlformats.org/drawingml/2006/main" noChangeAspect="1"/>
+            </wp:cNvGraphicFramePr>
+            <a:graphic xmlns:a="http://schemas.openxmlformats.org/drawingml/2006/main">
+              <a:graphicData uri="http://schemas.openxmlformats.org/drawingml/2006/picture">
+                <pic:pic xmlns:pic="http://schemas.openxmlformats.org/drawingml/2006/picture">
+                  <pic:nvPicPr>
+                    <pic:cNvPr id="5" name="Image5" descr="A screenshot of a computer screen&#10;&#10;Description automatically generated with medium confidence"/>
+                    <pic:cNvPicPr>
+                      <a:picLocks noChangeAspect="1" noChangeArrowheads="1"/>
+                    </pic:cNvPicPr>
+                  </pic:nvPicPr>
+                  <pic:blipFill>
+                    <a:blip r:embed="rId13"/>
+                    <a:stretch>
+                      <a:fillRect/>
+                    </a:stretch>
+                  </pic:blipFill>
+                  <pic:spPr bwMode="auto">
+                    <a:xfrm>
+                      <a:off x="0" y="0"/>
+                      <a:ext cx="2743200" cy="2099310"/>
+                    </a:xfrm>
+                    <a:prstGeom prst="rect">
+                      <a:avLst/>
+                    </a:prstGeom>
+                    <a:noFill/>
+                  </pic:spPr>
+                </pic:pic>
+              </a:graphicData>
+            </a:graphic>
+          </wp:inline>
+        </w:drawing>
+      </w:r>
+    </w:p>
+    <w:p>
+      <w:pPr>
+        <w:spacing w:after="0" w:line="240" w:lineRule="auto"/>
+        <w:ind w:left="1080" w:firstLine="0"/>
+      </w:pPr>
+    </w:p>
+    <w:p>
+      <w:pPr>
+        <w:spacing w:after="160" w:line="259" w:lineRule="auto"/>
+        <w:ind w:left="0" w:firstLine="0"/>
+      </w:pPr>
+      <w:r>
+        <w:br w:type="page"/>
+      </w:r>
+    </w:p>
+    <w:p>
+      <w:pPr>
+        <w:spacing w:after="0" w:line="240" w:lineRule="auto"/>
+        <w:ind w:left="0" w:firstLine="0"/>
+      </w:pPr>
+    </w:p>
+    <w:p>
+      <w:pPr>
+        <w:pStyle w:val="ListParagraph"/>
+        <w:numPr>
+          <w:ilvl w:val="1"/>
+          <w:numId w:val="2"/>
+        </w:numPr>
+        <w:spacing w:after="0" w:line="240" w:lineRule="auto"/>
+      </w:pPr>
+      <w:r>
+        <w:t>Put Xilinx in the root directory of your preferred (biggest) drive.</w:t>
+      </w:r>
+    </w:p>
+    <w:p>
+      <w:pPr>
+        <w:spacing w:after="0" w:line="240" w:lineRule="auto"/>
+        <w:ind w:left="1080" w:firstLine="0"/>
+      </w:pPr>
+      <w:r>
+        <w:rPr>
+          <w:noProof/>
+        </w:rPr>
+        <w:drawing>
+          <wp:inline distT="0" distB="0" distL="0" distR="0">
+            <wp:extent cx="2743200" cy="2099310"/>
+            <wp:effectExtent l="0" t="0" r="0" b="0"/>
+            <wp:docPr id="6" name="Image6" descr="A screenshot of a computer&#10;&#10;Description automatically generated"/>
+            <wp:cNvGraphicFramePr>
+              <a:graphicFrameLocks xmlns:a="http://schemas.openxmlformats.org/drawingml/2006/main" noChangeAspect="1"/>
+            </wp:cNvGraphicFramePr>
+            <a:graphic xmlns:a="http://schemas.openxmlformats.org/drawingml/2006/main">
+              <a:graphicData uri="http://schemas.openxmlformats.org/drawingml/2006/picture">
+                <pic:pic xmlns:pic="http://schemas.openxmlformats.org/drawingml/2006/picture">
+                  <pic:nvPicPr>
+                    <pic:cNvPr id="6" name="Image6" descr="A screenshot of a computer&#10;&#10;Description automatically generated"/>
+                    <pic:cNvPicPr>
+                      <a:picLocks noChangeAspect="1" noChangeArrowheads="1"/>
+                    </pic:cNvPicPr>
+                  </pic:nvPicPr>
+                  <pic:blipFill>
+                    <a:blip r:embed="rId14"/>
+                    <a:stretch>
+                      <a:fillRect/>
+                    </a:stretch>
+                  </pic:blipFill>
+                  <pic:spPr bwMode="auto">
+                    <a:xfrm>
+                      <a:off x="0" y="0"/>
+                      <a:ext cx="2743200" cy="2099310"/>
+                    </a:xfrm>
+                    <a:prstGeom prst="rect">
+                      <a:avLst/>
+                    </a:prstGeom>
+                    <a:noFill/>
+                  </pic:spPr>
+                </pic:pic>
+              </a:graphicData>
+            </a:graphic>
+          </wp:inline>
+        </w:drawing>
+      </w:r>
+    </w:p>
+    <w:p>
+      <w:pPr>
+        <w:spacing w:after="0" w:line="240" w:lineRule="auto"/>
+        <w:ind w:left="1080" w:firstLine="0"/>
+      </w:pPr>
+    </w:p>
+    <w:p>
+      <w:pPr>
+        <w:pStyle w:val="ListParagraph"/>
+        <w:numPr>
+          <w:ilvl w:val="1"/>
+          <w:numId w:val="2"/>
+        </w:numPr>
+        <w:spacing w:after="0" w:line="240" w:lineRule="auto"/>
+      </w:pPr>
+      <w:r>
+        <w:t>Click Install.</w:t>
+      </w:r>
+    </w:p>
+    <w:p>
+      <w:pPr>
+        <w:spacing w:after="0" w:line="240" w:lineRule="auto"/>
+        <w:ind w:left="1080" w:firstLine="0"/>
+      </w:pPr>
+      <w:r>
+        <w:rPr>
+          <w:noProof/>
+        </w:rPr>
+        <w:drawing>
+          <wp:inline distT="0" distB="0" distL="0" distR="0">
+            <wp:extent cx="2743200" cy="2099310"/>
+            <wp:effectExtent l="0" t="0" r="0" b="0"/>
+            <wp:docPr id="7" name="Image7" descr="A screenshot of a computer&#10;&#10;Description automatically generated"/>
+            <wp:cNvGraphicFramePr>
+              <a:graphicFrameLocks xmlns:a="http://schemas.openxmlformats.org/drawingml/2006/main" noChangeAspect="1"/>
+            </wp:cNvGraphicFramePr>
+            <a:graphic xmlns:a="http://schemas.openxmlformats.org/drawingml/2006/main">
+              <a:graphicData uri="http://schemas.openxmlformats.org/drawingml/2006/picture">
+                <pic:pic xmlns:pic="http://schemas.openxmlformats.org/drawingml/2006/picture">
+                  <pic:nvPicPr>
+                    <pic:cNvPr id="7" name="Image7" descr="A screenshot of a computer&#10;&#10;Description automatically generated"/>
+                    <pic:cNvPicPr>
+                      <a:picLocks noChangeAspect="1" noChangeArrowheads="1"/>
+                    </pic:cNvPicPr>
+                  </pic:nvPicPr>
+                  <pic:blipFill>
+                    <a:blip r:embed="rId15"/>
+                    <a:stretch>
+                      <a:fillRect/>
+                    </a:stretch>
+                  </pic:blipFill>
+                  <pic:spPr bwMode="auto">
+                    <a:xfrm>
+                      <a:off x="0" y="0"/>
+                      <a:ext cx="2743200" cy="2099310"/>
+                    </a:xfrm>
+                    <a:prstGeom prst="rect">
+                      <a:avLst/>
+                    </a:prstGeom>
+                    <a:noFill/>
+                  </pic:spPr>
+                </pic:pic>
+              </a:graphicData>
+            </a:graphic>
+          </wp:inline>
+        </w:drawing>
+      </w:r>
+    </w:p>
+    <w:p>
+      <w:pPr>
+        <w:pStyle w:val="ListParagraph"/>
+        <w:ind w:left="1440"/>
+      </w:pPr>
+      <w:r>
+        <w:br/>
+      </w:r>
+    </w:p>
+    <w:p>
+      <w:pPr>
+        <w:pStyle w:val="ListParagraph"/>
+        <w:numPr>
+          <w:ilvl w:val="1"/>
+          <w:numId w:val="2"/>
+        </w:numPr>
+        <w:spacing w:after="0" w:line="240" w:lineRule="auto"/>
+      </w:pPr>
+      <w:r>
+        <w:t>A few hours later…</w:t>
+      </w:r>
+    </w:p>
+    <w:p>
+      <w:pPr>
+        <w:pStyle w:val="ListParagraph"/>
+        <w:ind w:left="1440"/>
+      </w:pPr>
+      <w:r>
+        <w:rPr>
+          <w:noProof/>
+        </w:rPr>
+        <w:drawing>
+          <wp:inline distT="0" distB="0" distL="0" distR="0">
+            <wp:extent cx="2822575" cy="2160270"/>
+            <wp:effectExtent l="0" t="0" r="0" b="0"/>
+            <wp:docPr id="8" name="Picture 4"/>
+            <wp:cNvGraphicFramePr>
+              <a:graphicFrameLocks xmlns:a="http://schemas.openxmlformats.org/drawingml/2006/main" noChangeAspect="1"/>
+            </wp:cNvGraphicFramePr>
+            <a:graphic xmlns:a="http://schemas.openxmlformats.org/drawingml/2006/main">
+              <a:graphicData uri="http://schemas.openxmlformats.org/drawingml/2006/picture">
+                <pic:pic xmlns:pic="http://schemas.openxmlformats.org/drawingml/2006/picture">
+                  <pic:nvPicPr>
+                    <pic:cNvPr id="8" name="Picture 4"/>
+                    <pic:cNvPicPr>
+                      <a:picLocks noChangeAspect="1" noChangeArrowheads="1"/>
+                    </pic:cNvPicPr>
+                  </pic:nvPicPr>
+                  <pic:blipFill>
+                    <a:blip r:embed="rId16"/>
                     <a:stretch>
                       <a:fillRect/>
                     </a:stretch>
@@ -719,12 +655,8 @@
     <w:p>
       <w:pPr>
         <w:pStyle w:val="ListParagraph"/>
-        <w:ind w:hanging="10" w:left="1440"/>
-        <w:rPr/>
-      </w:pPr>
-      <w:r>
-        <w:rPr/>
-      </w:r>
+        <w:ind w:left="1440"/>
+      </w:pPr>
     </w:p>
     <w:p>
       <w:pPr>
@@ -733,34 +665,24 @@
           <w:ilvl w:val="1"/>
           <w:numId w:val="2"/>
         </w:numPr>
-        <w:spacing w:lineRule="auto" w:line="240" w:before="0" w:after="0"/>
-        <w:contextualSpacing/>
-        <w:rPr/>
-      </w:pPr>
-      <w:r>
-        <w:rPr/>
+        <w:spacing w:after="0" w:line="240" w:lineRule="auto"/>
+      </w:pPr>
+      <w:r>
         <w:t>After this, you should be all set to go.</w:t>
       </w:r>
     </w:p>
     <w:p>
-      <w:pPr>
-        <w:pStyle w:val="Normal"/>
-        <w:rPr/>
-      </w:pPr>
-      <w:r>
-        <w:rPr/>
+      <w:r>
         <w:t xml:space="preserve"> </w:t>
       </w:r>
       <w:r>
-        <w:rPr/>
         <w:tab/>
       </w:r>
     </w:p>
     <w:p>
       <w:pPr>
-        <w:pStyle w:val="Normal"/>
         <w:rPr>
-          <w:rFonts w:ascii="Calibri Light" w:hAnsi="Calibri Light" w:cs="Calibri Light" w:asciiTheme="majorHAnsi" w:cstheme="majorHAnsi" w:hAnsiTheme="majorHAnsi"/>
+          <w:rFonts w:asciiTheme="majorHAnsi" w:hAnsiTheme="majorHAnsi" w:cstheme="majorHAnsi"/>
           <w:b/>
           <w:bCs/>
           <w:sz w:val="28"/>
@@ -769,47 +691,44 @@
       </w:pPr>
       <w:r>
         <w:rPr>
-          <w:rFonts w:cs="Calibri Light" w:ascii="Calibri Light" w:hAnsi="Calibri Light" w:asciiTheme="majorHAnsi" w:cstheme="majorHAnsi" w:hAnsiTheme="majorHAnsi"/>
+          <w:rFonts w:asciiTheme="majorHAnsi" w:hAnsiTheme="majorHAnsi" w:cstheme="majorHAnsi"/>
           <w:b/>
           <w:bCs/>
           <w:sz w:val="28"/>
           <w:szCs w:val="28"/>
         </w:rPr>
+        <w:lastRenderedPageBreak/>
         <w:t>Potential Installation Issue </w:t>
       </w:r>
     </w:p>
     <w:p>
-      <w:pPr>
-        <w:pStyle w:val="Normal"/>
-        <w:rPr/>
-      </w:pPr>
-      <w:r>
-        <w:rPr/>
-        <w:t>If you are running Windows and get an error saying that VCOMP140.dll was not found when opening Vitis/Vivado you may be missing a component of the Visual Studio 2015 redistributable. To resolve this error, install the Community Edition of Visual Studio 2022 and add the MSVC 2015 component, like shown in the below image. The other stuff checked is only important in case you want to do C/C++ development with Visual Studio.</w:t>
-      </w:r>
-    </w:p>
-    <w:p>
-      <w:pPr>
-        <w:pStyle w:val="Normal"/>
-        <w:rPr/>
-      </w:pPr>
-      <w:r>
-        <w:rPr/>
+      <w:r>
+        <w:t>If you are running Windows and get an error saying that VCOMP140.dll was not found when opening Vitis/</w:t>
+      </w:r>
+      <w:proofErr w:type="spellStart"/>
+      <w:r>
+        <w:t>Vivado</w:t>
+      </w:r>
+      <w:proofErr w:type="spellEnd"/>
+      <w:r>
+        <w:t xml:space="preserve"> you may be missing a component of the Visual Studio 2015 redistributable. To resolve this error, install the Community Edition of Visual Studio 2022 and add the MSVC 2015 component, like shown in the below image. The other stuff checked is only important in case you want to do C/C++ development with Visual Studio.</w:t>
+      </w:r>
+    </w:p>
+    <w:p>
+      <w:r>
         <w:t> </w:t>
       </w:r>
     </w:p>
     <w:p>
-      <w:pPr>
-        <w:pStyle w:val="Normal"/>
-        <w:rPr/>
-      </w:pPr>
-      <w:r>
-        <w:rPr/>
+      <w:r>
+        <w:rPr>
+          <w:noProof/>
+        </w:rPr>
         <w:drawing>
           <wp:inline distT="0" distB="0" distL="0" distR="0">
             <wp:extent cx="2741295" cy="5221605"/>
             <wp:effectExtent l="0" t="0" r="0" b="0"/>
-            <wp:docPr id="9" name="Picture 2" descr=""/>
+            <wp:docPr id="9" name="Picture 2"/>
             <wp:cNvGraphicFramePr>
               <a:graphicFrameLocks xmlns:a="http://schemas.openxmlformats.org/drawingml/2006/main" noChangeAspect="1"/>
             </wp:cNvGraphicFramePr>
@@ -817,13 +736,13 @@
               <a:graphicData uri="http://schemas.openxmlformats.org/drawingml/2006/picture">
                 <pic:pic xmlns:pic="http://schemas.openxmlformats.org/drawingml/2006/picture">
                   <pic:nvPicPr>
-                    <pic:cNvPr id="9" name="Picture 2" descr=""/>
+                    <pic:cNvPr id="9" name="Picture 2"/>
                     <pic:cNvPicPr>
                       <a:picLocks noChangeAspect="1" noChangeArrowheads="1"/>
                     </pic:cNvPicPr>
                   </pic:nvPicPr>
                   <pic:blipFill>
-                    <a:blip r:embed="rId11"/>
+                    <a:blip r:embed="rId17"/>
                     <a:stretch>
                       <a:fillRect/>
                     </a:stretch>
@@ -846,81 +765,54 @@
       </w:r>
     </w:p>
     <w:p>
-      <w:pPr>
-        <w:pStyle w:val="Normal"/>
-        <w:rPr/>
-      </w:pPr>
-      <w:r>
-        <w:rPr/>
+      <w:r>
         <w:t> </w:t>
       </w:r>
     </w:p>
     <w:p>
       <w:pPr>
         <w:pStyle w:val="Heading1"/>
-        <w:rPr/>
-      </w:pPr>
-      <w:r>
-        <w:rPr/>
+      </w:pPr>
+      <w:r>
         <w:t>Linux Notes</w:t>
       </w:r>
     </w:p>
     <w:p>
       <w:pPr>
-        <w:pStyle w:val="Normal"/>
         <w:numPr>
           <w:ilvl w:val="0"/>
           <w:numId w:val="3"/>
         </w:numPr>
-        <w:rPr/>
-      </w:pPr>
-      <w:r>
-        <w:rPr/>
-        <w:t>20</w:t>
-      </w:r>
-      <w:r>
-        <w:rPr/>
-        <w:t>23</w:t>
-      </w:r>
-      <w:r>
-        <w:rPr/>
-        <w:t>.1 refused to start the installer, 202</w:t>
-      </w:r>
-      <w:r>
-        <w:rPr/>
-        <w:t>3</w:t>
-      </w:r>
-      <w:r>
-        <w:rPr/>
-        <w:t>.2 fixes this</w:t>
-      </w:r>
-    </w:p>
-    <w:p>
-      <w:pPr>
-        <w:pStyle w:val="Normal"/>
+      </w:pPr>
+      <w:r>
+        <w:t>2023.1 refused to start the installer, 2023.2 fixes this</w:t>
+      </w:r>
+    </w:p>
+    <w:p>
+      <w:pPr>
         <w:numPr>
           <w:ilvl w:val="0"/>
           <w:numId w:val="3"/>
         </w:numPr>
-        <w:rPr/>
-      </w:pPr>
-      <w:r>
-        <w:rPr/>
+      </w:pPr>
+      <w:r>
         <w:t>Install libtinfo5 and Libncurses5 or you will be stuck at “Generating installed device list”</w:t>
       </w:r>
     </w:p>
     <w:p>
       <w:pPr>
-        <w:pStyle w:val="Normal"/>
         <w:numPr>
           <w:ilvl w:val="0"/>
           <w:numId w:val="3"/>
         </w:numPr>
-        <w:rPr/>
-      </w:pPr>
-      <w:r>
+      </w:pPr>
+      <w:r>
+        <w:rPr>
+          <w:noProof/>
+        </w:rPr>
+        <w:lastRenderedPageBreak/>
         <w:drawing>
-          <wp:anchor behindDoc="0" distT="0" distB="0" distL="0" distR="0" simplePos="0" locked="0" layoutInCell="0" allowOverlap="1" relativeHeight="12">
+          <wp:anchor distT="0" distB="0" distL="0" distR="0" simplePos="0" relativeHeight="12" behindDoc="0" locked="0" layoutInCell="0" allowOverlap="1">
             <wp:simplePos x="0" y="0"/>
             <wp:positionH relativeFrom="column">
               <wp:posOffset>288290</wp:posOffset>
@@ -931,7 +823,7 @@
             <wp:extent cx="5717540" cy="2588260"/>
             <wp:effectExtent l="0" t="0" r="0" b="0"/>
             <wp:wrapTopAndBottom/>
-            <wp:docPr id="10" name="Image1" descr=""/>
+            <wp:docPr id="10" name="Image1"/>
             <wp:cNvGraphicFramePr>
               <a:graphicFrameLocks xmlns:a="http://schemas.openxmlformats.org/drawingml/2006/main" noChangeAspect="1"/>
             </wp:cNvGraphicFramePr>
@@ -939,13 +831,13 @@
               <a:graphicData uri="http://schemas.openxmlformats.org/drawingml/2006/picture">
                 <pic:pic xmlns:pic="http://schemas.openxmlformats.org/drawingml/2006/picture">
                   <pic:nvPicPr>
-                    <pic:cNvPr id="10" name="Image1" descr=""/>
+                    <pic:cNvPr id="10" name="Image1"/>
                     <pic:cNvPicPr>
                       <a:picLocks noChangeAspect="1" noChangeArrowheads="1"/>
                     </pic:cNvPicPr>
                   </pic:nvPicPr>
                   <pic:blipFill>
-                    <a:blip r:embed="rId12"/>
+                    <a:blip r:embed="rId18"/>
                     <a:stretch>
                       <a:fillRect/>
                     </a:stretch>
@@ -967,21 +859,17 @@
         </w:drawing>
       </w:r>
       <w:r>
-        <w:rPr/>
         <w:t>Installer does not set up cable drivers automatically. Run:</w:t>
       </w:r>
     </w:p>
     <w:p>
       <w:pPr>
-        <w:pStyle w:val="Normal"/>
         <w:numPr>
           <w:ilvl w:val="0"/>
           <w:numId w:val="3"/>
         </w:numPr>
-        <w:rPr/>
-      </w:pPr>
-      <w:r>
-        <w:rPr/>
+      </w:pPr>
+      <w:r>
         <w:t xml:space="preserve">For students running Linux, they need to make sure that they run the script </w:t>
       </w:r>
       <w:r>
@@ -991,101 +879,122 @@
         <w:t xml:space="preserve">/tools/Xilinx/2025.1/Vivado/scripts/installLibs.sh </w:t>
       </w:r>
       <w:r>
-        <w:rPr/>
-        <w:t>/tools/Xilinx/Vitis/2023.2/scripts/installLibs.sh once completing the normal installation process. This should get output over stdout/stderr when students run the installation executable. It looks like students need to use a supported OS to get Vivado to work. Would recommend using Ubuntu.</w:t>
-      </w:r>
-    </w:p>
-    <w:p>
-      <w:pPr>
-        <w:pStyle w:val="Normal"/>
-        <w:widowControl/>
-        <w:bidi w:val="0"/>
-        <w:spacing w:lineRule="auto" w:line="247" w:before="0" w:after="136"/>
-        <w:ind w:hanging="10" w:left="10"/>
-        <w:jc w:val="left"/>
-        <w:rPr/>
-      </w:pPr>
-      <w:r>
-        <w:rPr/>
-      </w:r>
-    </w:p>
+        <w:t xml:space="preserve">/tools/Xilinx/Vitis/2023.2/scripts/installLibs.sh once completing the normal installation process. This should get output over </w:t>
+      </w:r>
+      <w:proofErr w:type="spellStart"/>
+      <w:r>
+        <w:t>stdout</w:t>
+      </w:r>
+      <w:proofErr w:type="spellEnd"/>
+      <w:r>
+        <w:t xml:space="preserve">/stderr when students run the installation executable. It looks like students need to use a supported OS to get </w:t>
+      </w:r>
+      <w:proofErr w:type="spellStart"/>
+      <w:r>
+        <w:t>Vivado</w:t>
+      </w:r>
+      <w:proofErr w:type="spellEnd"/>
+      <w:r>
+        <w:t xml:space="preserve"> to work. Would recommend using Ubuntu.</w:t>
+      </w:r>
+    </w:p>
+    <w:p/>
     <w:sectPr>
-      <w:headerReference w:type="even" r:id="rId13"/>
-      <w:headerReference w:type="default" r:id="rId14"/>
-      <w:headerReference w:type="first" r:id="rId15"/>
-      <w:footerReference w:type="even" r:id="rId16"/>
-      <w:footerReference w:type="default" r:id="rId17"/>
-      <w:footerReference w:type="first" r:id="rId18"/>
-      <w:type w:val="nextPage"/>
+      <w:headerReference w:type="even" r:id="rId19"/>
+      <w:headerReference w:type="default" r:id="rId20"/>
+      <w:footerReference w:type="even" r:id="rId21"/>
+      <w:footerReference w:type="default" r:id="rId22"/>
+      <w:headerReference w:type="first" r:id="rId23"/>
+      <w:footerReference w:type="first" r:id="rId24"/>
       <w:pgSz w:w="12240" w:h="15840"/>
-      <w:pgMar w:left="1440" w:right="1436" w:gutter="0" w:header="720" w:top="1509" w:footer="719" w:bottom="1480"/>
-      <w:pgNumType w:fmt="decimal"/>
-      <w:formProt w:val="false"/>
+      <w:pgMar w:top="1509" w:right="1436" w:bottom="1480" w:left="1440" w:header="720" w:footer="719" w:gutter="0"/>
+      <w:cols w:space="720"/>
+      <w:formProt w:val="0"/>
       <w:titlePg/>
-      <w:textDirection w:val="lrTb"/>
-      <w:docGrid w:type="default" w:linePitch="100" w:charSpace="0"/>
+      <w:docGrid w:linePitch="100"/>
     </w:sectPr>
   </w:body>
 </w:document>
 </file>
 
+<file path=word/endnotes.xml><?xml version="1.0" encoding="utf-8"?>
+<w:endnotes xmlns:wpc="http://schemas.microsoft.com/office/word/2010/wordprocessingCanvas" xmlns:cx="http://schemas.microsoft.com/office/drawing/2014/chartex" xmlns:cx1="http://schemas.microsoft.com/office/drawing/2015/9/8/chartex" xmlns:cx2="http://schemas.microsoft.com/office/drawing/2015/10/21/chartex" xmlns:cx3="http://schemas.microsoft.com/office/drawing/2016/5/9/chartex" xmlns:cx4="http://schemas.microsoft.com/office/drawing/2016/5/10/chartex" xmlns:cx5="http://schemas.microsoft.com/office/drawing/2016/5/11/chartex" xmlns:cx6="http://schemas.microsoft.com/office/drawing/2016/5/12/chartex" xmlns:cx7="http://schemas.microsoft.com/office/drawing/2016/5/13/chartex" xmlns:cx8="http://schemas.microsoft.com/office/drawing/2016/5/14/chartex" xmlns:mc="http://schemas.openxmlformats.org/markup-compatibility/2006" xmlns:aink="http://schemas.microsoft.com/office/drawing/2016/ink" xmlns:am3d="http://schemas.microsoft.com/office/drawing/2017/model3d" xmlns:o="urn:schemas-microsoft-com:office:office" xmlns:oel="http://schemas.microsoft.com/office/2019/extlst" xmlns:r="http://schemas.openxmlformats.org/officeDocument/2006/relationships" xmlns:m="http://schemas.openxmlformats.org/officeDocument/2006/math" xmlns:v="urn:schemas-microsoft-com:vml" xmlns:wp14="http://schemas.microsoft.com/office/word/2010/wordprocessingDrawing" xmlns:wp="http://schemas.openxmlformats.org/drawingml/2006/wordprocessingDrawing" xmlns:w10="urn:schemas-microsoft-com:office:word" xmlns:w="http://schemas.openxmlformats.org/wordprocessingml/2006/main" xmlns:w14="http://schemas.microsoft.com/office/word/2010/wordml" xmlns:w15="http://schemas.microsoft.com/office/word/2012/wordml" xmlns:w16cex="http://schemas.microsoft.com/office/word/2018/wordml/cex" xmlns:w16cid="http://schemas.microsoft.com/office/word/2016/wordml/cid" xmlns:w16="http://schemas.microsoft.com/office/word/2018/wordml" xmlns:w16du="http://schemas.microsoft.com/office/word/2023/wordml/word16du" xmlns:w16sdtdh="http://schemas.microsoft.com/office/word/2020/wordml/sdtdatahash" xmlns:w16sdtfl="http://schemas.microsoft.com/office/word/2024/wordml/sdtformatlock" xmlns:w16se="http://schemas.microsoft.com/office/word/2015/wordml/symex" xmlns:wpg="http://schemas.microsoft.com/office/word/2010/wordprocessingGroup" xmlns:wpi="http://schemas.microsoft.com/office/word/2010/wordprocessingInk" xmlns:wne="http://schemas.microsoft.com/office/word/2006/wordml" xmlns:wps="http://schemas.microsoft.com/office/word/2010/wordprocessingShape" mc:Ignorable="w14 w15 w16se w16cid w16 w16cex w16sdtdh w16sdtfl w16du wp14">
+  <w:endnote w:type="separator" w:id="-1">
+    <w:p>
+      <w:pPr>
+        <w:spacing w:after="0" w:line="240" w:lineRule="auto"/>
+      </w:pPr>
+      <w:r>
+        <w:separator/>
+      </w:r>
+    </w:p>
+  </w:endnote>
+  <w:endnote w:type="continuationSeparator" w:id="0">
+    <w:p>
+      <w:pPr>
+        <w:spacing w:after="0" w:line="240" w:lineRule="auto"/>
+      </w:pPr>
+      <w:r>
+        <w:continuationSeparator/>
+      </w:r>
+    </w:p>
+  </w:endnote>
+</w:endnotes>
+</file>
+
 <file path=word/footer1.xml><?xml version="1.0" encoding="utf-8"?>
-<w:ftr xmlns:o="urn:schemas-microsoft-com:office:office" xmlns:r="http://schemas.openxmlformats.org/officeDocument/2006/relationships" xmlns:v="urn:schemas-microsoft-com:vml" xmlns:w="http://schemas.openxmlformats.org/wordprocessingml/2006/main" xmlns:w10="urn:schemas-microsoft-com:office:word" xmlns:wp="http://schemas.openxmlformats.org/drawingml/2006/wordprocessingDrawing" xmlns:pic="http://schemas.openxmlformats.org/drawingml/2006/picture" xmlns:wps="http://schemas.microsoft.com/office/word/2010/wordprocessingShape" xmlns:wpg="http://schemas.microsoft.com/office/word/2010/wordprocessingGroup" xmlns:mc="http://schemas.openxmlformats.org/markup-compatibility/2006" xmlns:wp14="http://schemas.microsoft.com/office/word/2010/wordprocessingDrawing" xmlns:w14="http://schemas.microsoft.com/office/word/2010/wordml" xmlns:w15="http://schemas.microsoft.com/office/word/2012/wordml" mc:Ignorable="w14 wp14 w15">
+<w:ftr xmlns:wpc="http://schemas.microsoft.com/office/word/2010/wordprocessingCanvas" xmlns:cx="http://schemas.microsoft.com/office/drawing/2014/chartex" xmlns:cx1="http://schemas.microsoft.com/office/drawing/2015/9/8/chartex" xmlns:cx2="http://schemas.microsoft.com/office/drawing/2015/10/21/chartex" xmlns:cx3="http://schemas.microsoft.com/office/drawing/2016/5/9/chartex" xmlns:cx4="http://schemas.microsoft.com/office/drawing/2016/5/10/chartex" xmlns:cx5="http://schemas.microsoft.com/office/drawing/2016/5/11/chartex" xmlns:cx6="http://schemas.microsoft.com/office/drawing/2016/5/12/chartex" xmlns:cx7="http://schemas.microsoft.com/office/drawing/2016/5/13/chartex" xmlns:cx8="http://schemas.microsoft.com/office/drawing/2016/5/14/chartex" xmlns:mc="http://schemas.openxmlformats.org/markup-compatibility/2006" xmlns:aink="http://schemas.microsoft.com/office/drawing/2016/ink" xmlns:am3d="http://schemas.microsoft.com/office/drawing/2017/model3d" xmlns:o="urn:schemas-microsoft-com:office:office" xmlns:oel="http://schemas.microsoft.com/office/2019/extlst" xmlns:r="http://schemas.openxmlformats.org/officeDocument/2006/relationships" xmlns:m="http://schemas.openxmlformats.org/officeDocument/2006/math" xmlns:v="urn:schemas-microsoft-com:vml" xmlns:wp14="http://schemas.microsoft.com/office/word/2010/wordprocessingDrawing" xmlns:wp="http://schemas.openxmlformats.org/drawingml/2006/wordprocessingDrawing" xmlns:w10="urn:schemas-microsoft-com:office:word" xmlns:w="http://schemas.openxmlformats.org/wordprocessingml/2006/main" xmlns:w14="http://schemas.microsoft.com/office/word/2010/wordml" xmlns:w15="http://schemas.microsoft.com/office/word/2012/wordml" xmlns:w16cex="http://schemas.microsoft.com/office/word/2018/wordml/cex" xmlns:w16cid="http://schemas.microsoft.com/office/word/2016/wordml/cid" xmlns:w16="http://schemas.microsoft.com/office/word/2018/wordml" xmlns:w16du="http://schemas.microsoft.com/office/word/2023/wordml/word16du" xmlns:w16sdtdh="http://schemas.microsoft.com/office/word/2020/wordml/sdtdatahash" xmlns:w16sdtfl="http://schemas.microsoft.com/office/word/2024/wordml/sdtformatlock" xmlns:w16se="http://schemas.microsoft.com/office/word/2015/wordml/symex" xmlns:wpg="http://schemas.microsoft.com/office/word/2010/wordprocessingGroup" xmlns:wpi="http://schemas.microsoft.com/office/word/2010/wordprocessingInk" xmlns:wne="http://schemas.microsoft.com/office/word/2006/wordml" xmlns:wps="http://schemas.microsoft.com/office/word/2010/wordprocessingShape" mc:Ignorable="w14 w15 w16se w16cid w16 w16cex w16sdtdh w16sdtfl w16du wp14">
   <w:p>
     <w:pPr>
-      <w:pStyle w:val="Normal"/>
-      <w:spacing w:lineRule="auto" w:line="259" w:before="0" w:after="0"/>
-      <w:ind w:hanging="0" w:left="0" w:right="1"/>
+      <w:spacing w:after="0" w:line="259" w:lineRule="auto"/>
+      <w:ind w:left="0" w:right="1" w:firstLine="0"/>
       <w:jc w:val="right"/>
-      <w:rPr/>
     </w:pPr>
     <w:r>
       <w:rPr>
-        <w:rFonts w:eastAsia="Calibri" w:cs="Calibri" w:ascii="Calibri" w:hAnsi="Calibri"/>
+        <w:rFonts w:ascii="Calibri" w:eastAsia="Calibri" w:hAnsi="Calibri" w:cs="Calibri"/>
       </w:rPr>
       <w:fldChar w:fldCharType="begin"/>
     </w:r>
     <w:r>
       <w:rPr>
-        <w:rFonts w:eastAsia="Calibri" w:cs="Calibri" w:ascii="Calibri" w:hAnsi="Calibri"/>
+        <w:rFonts w:ascii="Calibri" w:eastAsia="Calibri" w:hAnsi="Calibri" w:cs="Calibri"/>
       </w:rPr>
       <w:instrText xml:space="preserve"> PAGE </w:instrText>
     </w:r>
     <w:r>
       <w:rPr>
-        <w:rFonts w:eastAsia="Calibri" w:cs="Calibri" w:ascii="Calibri" w:hAnsi="Calibri"/>
+        <w:rFonts w:ascii="Calibri" w:eastAsia="Calibri" w:hAnsi="Calibri" w:cs="Calibri"/>
       </w:rPr>
       <w:fldChar w:fldCharType="separate"/>
     </w:r>
     <w:r>
       <w:rPr>
-        <w:rFonts w:eastAsia="Calibri" w:cs="Calibri" w:ascii="Calibri" w:hAnsi="Calibri"/>
+        <w:rFonts w:ascii="Calibri" w:eastAsia="Calibri" w:hAnsi="Calibri" w:cs="Calibri"/>
       </w:rPr>
       <w:t>0</w:t>
     </w:r>
     <w:r>
       <w:rPr>
-        <w:rFonts w:eastAsia="Calibri" w:cs="Calibri" w:ascii="Calibri" w:hAnsi="Calibri"/>
+        <w:rFonts w:ascii="Calibri" w:eastAsia="Calibri" w:hAnsi="Calibri" w:cs="Calibri"/>
       </w:rPr>
       <w:fldChar w:fldCharType="end"/>
     </w:r>
     <w:r>
       <w:rPr>
-        <w:rFonts w:eastAsia="Calibri" w:cs="Calibri" w:ascii="Calibri" w:hAnsi="Calibri"/>
+        <w:rFonts w:ascii="Calibri" w:eastAsia="Calibri" w:hAnsi="Calibri" w:cs="Calibri"/>
       </w:rPr>
       <w:t xml:space="preserve"> </w:t>
     </w:r>
   </w:p>
   <w:p>
     <w:pPr>
-      <w:pStyle w:val="Normal"/>
-      <w:spacing w:lineRule="auto" w:line="259" w:before="0" w:after="0"/>
-      <w:ind w:hanging="0" w:left="0"/>
-      <w:rPr/>
+      <w:spacing w:after="0" w:line="259" w:lineRule="auto"/>
+      <w:ind w:left="0" w:firstLine="0"/>
     </w:pPr>
     <w:r>
       <w:rPr>
-        <w:rFonts w:eastAsia="Calibri" w:cs="Calibri" w:ascii="Calibri" w:hAnsi="Calibri"/>
+        <w:rFonts w:ascii="Calibri" w:eastAsia="Calibri" w:hAnsi="Calibri" w:cs="Calibri"/>
       </w:rPr>
       <w:t xml:space="preserve"> </w:t>
     </w:r>
@@ -1094,14 +1003,12 @@
 </file>
 
 <file path=word/footer2.xml><?xml version="1.0" encoding="utf-8"?>
-<w:ftr xmlns:o="urn:schemas-microsoft-com:office:office" xmlns:r="http://schemas.openxmlformats.org/officeDocument/2006/relationships" xmlns:v="urn:schemas-microsoft-com:vml" xmlns:w="http://schemas.openxmlformats.org/wordprocessingml/2006/main" xmlns:w10="urn:schemas-microsoft-com:office:word" xmlns:wp="http://schemas.openxmlformats.org/drawingml/2006/wordprocessingDrawing" xmlns:pic="http://schemas.openxmlformats.org/drawingml/2006/picture" xmlns:wps="http://schemas.microsoft.com/office/word/2010/wordprocessingShape" xmlns:wpg="http://schemas.microsoft.com/office/word/2010/wordprocessingGroup" xmlns:mc="http://schemas.openxmlformats.org/markup-compatibility/2006" xmlns:wp14="http://schemas.microsoft.com/office/word/2010/wordprocessingDrawing" xmlns:w14="http://schemas.microsoft.com/office/word/2010/wordml" xmlns:w15="http://schemas.microsoft.com/office/word/2012/wordml" mc:Ignorable="w14 wp14 w15">
+<w:ftr xmlns:wpc="http://schemas.microsoft.com/office/word/2010/wordprocessingCanvas" xmlns:cx="http://schemas.microsoft.com/office/drawing/2014/chartex" xmlns:cx1="http://schemas.microsoft.com/office/drawing/2015/9/8/chartex" xmlns:cx2="http://schemas.microsoft.com/office/drawing/2015/10/21/chartex" xmlns:cx3="http://schemas.microsoft.com/office/drawing/2016/5/9/chartex" xmlns:cx4="http://schemas.microsoft.com/office/drawing/2016/5/10/chartex" xmlns:cx5="http://schemas.microsoft.com/office/drawing/2016/5/11/chartex" xmlns:cx6="http://schemas.microsoft.com/office/drawing/2016/5/12/chartex" xmlns:cx7="http://schemas.microsoft.com/office/drawing/2016/5/13/chartex" xmlns:cx8="http://schemas.microsoft.com/office/drawing/2016/5/14/chartex" xmlns:mc="http://schemas.openxmlformats.org/markup-compatibility/2006" xmlns:aink="http://schemas.microsoft.com/office/drawing/2016/ink" xmlns:am3d="http://schemas.microsoft.com/office/drawing/2017/model3d" xmlns:o="urn:schemas-microsoft-com:office:office" xmlns:oel="http://schemas.microsoft.com/office/2019/extlst" xmlns:r="http://schemas.openxmlformats.org/officeDocument/2006/relationships" xmlns:m="http://schemas.openxmlformats.org/officeDocument/2006/math" xmlns:v="urn:schemas-microsoft-com:vml" xmlns:wp14="http://schemas.microsoft.com/office/word/2010/wordprocessingDrawing" xmlns:wp="http://schemas.openxmlformats.org/drawingml/2006/wordprocessingDrawing" xmlns:w10="urn:schemas-microsoft-com:office:word" xmlns:w="http://schemas.openxmlformats.org/wordprocessingml/2006/main" xmlns:w14="http://schemas.microsoft.com/office/word/2010/wordml" xmlns:w15="http://schemas.microsoft.com/office/word/2012/wordml" xmlns:w16cex="http://schemas.microsoft.com/office/word/2018/wordml/cex" xmlns:w16cid="http://schemas.microsoft.com/office/word/2016/wordml/cid" xmlns:w16="http://schemas.microsoft.com/office/word/2018/wordml" xmlns:w16du="http://schemas.microsoft.com/office/word/2023/wordml/word16du" xmlns:w16sdtdh="http://schemas.microsoft.com/office/word/2020/wordml/sdtdatahash" xmlns:w16sdtfl="http://schemas.microsoft.com/office/word/2024/wordml/sdtformatlock" xmlns:w16se="http://schemas.microsoft.com/office/word/2015/wordml/symex" xmlns:wpg="http://schemas.microsoft.com/office/word/2010/wordprocessingGroup" xmlns:wpi="http://schemas.microsoft.com/office/word/2010/wordprocessingInk" xmlns:wne="http://schemas.microsoft.com/office/word/2006/wordml" xmlns:wps="http://schemas.microsoft.com/office/word/2010/wordprocessingShape" mc:Ignorable="w14 w15 w16se w16cid w16 w16cex w16sdtdh w16sdtfl w16du wp14">
   <w:p>
     <w:pPr>
-      <w:pStyle w:val="Normal"/>
-      <w:spacing w:lineRule="auto" w:line="259" w:before="0" w:after="0"/>
-      <w:ind w:hanging="0" w:left="0" w:right="1"/>
+      <w:spacing w:after="0" w:line="259" w:lineRule="auto"/>
+      <w:ind w:left="0" w:right="1" w:firstLine="0"/>
       <w:jc w:val="right"/>
-      <w:rPr/>
     </w:pPr>
     <w:r>
       <w:rPr>
@@ -1142,14 +1049,12 @@
   </w:p>
   <w:p>
     <w:pPr>
-      <w:pStyle w:val="Normal"/>
-      <w:spacing w:lineRule="auto" w:line="259" w:before="0" w:after="0"/>
-      <w:ind w:hanging="0" w:left="0"/>
-      <w:rPr/>
+      <w:spacing w:after="0" w:line="259" w:lineRule="auto"/>
+      <w:ind w:left="0" w:firstLine="0"/>
     </w:pPr>
     <w:r>
       <w:rPr>
-        <w:rFonts w:eastAsia="Calibri" w:cs="Calibri" w:ascii="Calibri" w:hAnsi="Calibri"/>
+        <w:rFonts w:ascii="Calibri" w:eastAsia="Calibri" w:hAnsi="Calibri" w:cs="Calibri"/>
       </w:rPr>
       <w:t xml:space="preserve"> </w:t>
     </w:r>
@@ -1158,14 +1063,12 @@
 </file>
 
 <file path=word/footer3.xml><?xml version="1.0" encoding="utf-8"?>
-<w:ftr xmlns:o="urn:schemas-microsoft-com:office:office" xmlns:r="http://schemas.openxmlformats.org/officeDocument/2006/relationships" xmlns:v="urn:schemas-microsoft-com:vml" xmlns:w="http://schemas.openxmlformats.org/wordprocessingml/2006/main" xmlns:w10="urn:schemas-microsoft-com:office:word" xmlns:wp="http://schemas.openxmlformats.org/drawingml/2006/wordprocessingDrawing" xmlns:pic="http://schemas.openxmlformats.org/drawingml/2006/picture" xmlns:wps="http://schemas.microsoft.com/office/word/2010/wordprocessingShape" xmlns:wpg="http://schemas.microsoft.com/office/word/2010/wordprocessingGroup" xmlns:mc="http://schemas.openxmlformats.org/markup-compatibility/2006" xmlns:wp14="http://schemas.microsoft.com/office/word/2010/wordprocessingDrawing" xmlns:w14="http://schemas.microsoft.com/office/word/2010/wordml" xmlns:w15="http://schemas.microsoft.com/office/word/2012/wordml" mc:Ignorable="w14 wp14 w15">
+<w:ftr xmlns:wpc="http://schemas.microsoft.com/office/word/2010/wordprocessingCanvas" xmlns:cx="http://schemas.microsoft.com/office/drawing/2014/chartex" xmlns:cx1="http://schemas.microsoft.com/office/drawing/2015/9/8/chartex" xmlns:cx2="http://schemas.microsoft.com/office/drawing/2015/10/21/chartex" xmlns:cx3="http://schemas.microsoft.com/office/drawing/2016/5/9/chartex" xmlns:cx4="http://schemas.microsoft.com/office/drawing/2016/5/10/chartex" xmlns:cx5="http://schemas.microsoft.com/office/drawing/2016/5/11/chartex" xmlns:cx6="http://schemas.microsoft.com/office/drawing/2016/5/12/chartex" xmlns:cx7="http://schemas.microsoft.com/office/drawing/2016/5/13/chartex" xmlns:cx8="http://schemas.microsoft.com/office/drawing/2016/5/14/chartex" xmlns:mc="http://schemas.openxmlformats.org/markup-compatibility/2006" xmlns:aink="http://schemas.microsoft.com/office/drawing/2016/ink" xmlns:am3d="http://schemas.microsoft.com/office/drawing/2017/model3d" xmlns:o="urn:schemas-microsoft-com:office:office" xmlns:oel="http://schemas.microsoft.com/office/2019/extlst" xmlns:r="http://schemas.openxmlformats.org/officeDocument/2006/relationships" xmlns:m="http://schemas.openxmlformats.org/officeDocument/2006/math" xmlns:v="urn:schemas-microsoft-com:vml" xmlns:wp14="http://schemas.microsoft.com/office/word/2010/wordprocessingDrawing" xmlns:wp="http://schemas.openxmlformats.org/drawingml/2006/wordprocessingDrawing" xmlns:w10="urn:schemas-microsoft-com:office:word" xmlns:w="http://schemas.openxmlformats.org/wordprocessingml/2006/main" xmlns:w14="http://schemas.microsoft.com/office/word/2010/wordml" xmlns:w15="http://schemas.microsoft.com/office/word/2012/wordml" xmlns:w16cex="http://schemas.microsoft.com/office/word/2018/wordml/cex" xmlns:w16cid="http://schemas.microsoft.com/office/word/2016/wordml/cid" xmlns:w16="http://schemas.microsoft.com/office/word/2018/wordml" xmlns:w16du="http://schemas.microsoft.com/office/word/2023/wordml/word16du" xmlns:w16sdtdh="http://schemas.microsoft.com/office/word/2020/wordml/sdtdatahash" xmlns:w16sdtfl="http://schemas.microsoft.com/office/word/2024/wordml/sdtformatlock" xmlns:w16se="http://schemas.microsoft.com/office/word/2015/wordml/symex" xmlns:wpg="http://schemas.microsoft.com/office/word/2010/wordprocessingGroup" xmlns:wpi="http://schemas.microsoft.com/office/word/2010/wordprocessingInk" xmlns:wne="http://schemas.microsoft.com/office/word/2006/wordml" xmlns:wps="http://schemas.microsoft.com/office/word/2010/wordprocessingShape" mc:Ignorable="w14 w15 w16se w16cid w16 w16cex w16sdtdh w16sdtfl w16du wp14">
   <w:p>
     <w:pPr>
-      <w:pStyle w:val="Normal"/>
-      <w:spacing w:lineRule="auto" w:line="259" w:before="0" w:after="0"/>
-      <w:ind w:hanging="0" w:left="0" w:right="1"/>
+      <w:spacing w:after="0" w:line="259" w:lineRule="auto"/>
+      <w:ind w:left="0" w:right="1" w:firstLine="0"/>
       <w:jc w:val="right"/>
-      <w:rPr/>
     </w:pPr>
     <w:r>
       <w:rPr>
@@ -1206,14 +1109,12 @@
   </w:p>
   <w:p>
     <w:pPr>
-      <w:pStyle w:val="Normal"/>
-      <w:spacing w:lineRule="auto" w:line="259" w:before="0" w:after="0"/>
-      <w:ind w:hanging="0" w:left="0"/>
-      <w:rPr/>
+      <w:spacing w:after="0" w:line="259" w:lineRule="auto"/>
+      <w:ind w:left="0" w:firstLine="0"/>
     </w:pPr>
     <w:r>
       <w:rPr>
-        <w:rFonts w:eastAsia="Calibri" w:cs="Calibri" w:ascii="Calibri" w:hAnsi="Calibri"/>
+        <w:rFonts w:ascii="Calibri" w:eastAsia="Calibri" w:hAnsi="Calibri" w:cs="Calibri"/>
       </w:rPr>
       <w:t xml:space="preserve"> </w:t>
     </w:r>
@@ -1221,19 +1122,45 @@
 </w:ftr>
 </file>
 
+<file path=word/footnotes.xml><?xml version="1.0" encoding="utf-8"?>
+<w:footnotes xmlns:wpc="http://schemas.microsoft.com/office/word/2010/wordprocessingCanvas" xmlns:cx="http://schemas.microsoft.com/office/drawing/2014/chartex" xmlns:cx1="http://schemas.microsoft.com/office/drawing/2015/9/8/chartex" xmlns:cx2="http://schemas.microsoft.com/office/drawing/2015/10/21/chartex" xmlns:cx3="http://schemas.microsoft.com/office/drawing/2016/5/9/chartex" xmlns:cx4="http://schemas.microsoft.com/office/drawing/2016/5/10/chartex" xmlns:cx5="http://schemas.microsoft.com/office/drawing/2016/5/11/chartex" xmlns:cx6="http://schemas.microsoft.com/office/drawing/2016/5/12/chartex" xmlns:cx7="http://schemas.microsoft.com/office/drawing/2016/5/13/chartex" xmlns:cx8="http://schemas.microsoft.com/office/drawing/2016/5/14/chartex" xmlns:mc="http://schemas.openxmlformats.org/markup-compatibility/2006" xmlns:aink="http://schemas.microsoft.com/office/drawing/2016/ink" xmlns:am3d="http://schemas.microsoft.com/office/drawing/2017/model3d" xmlns:o="urn:schemas-microsoft-com:office:office" xmlns:oel="http://schemas.microsoft.com/office/2019/extlst" xmlns:r="http://schemas.openxmlformats.org/officeDocument/2006/relationships" xmlns:m="http://schemas.openxmlformats.org/officeDocument/2006/math" xmlns:v="urn:schemas-microsoft-com:vml" xmlns:wp14="http://schemas.microsoft.com/office/word/2010/wordprocessingDrawing" xmlns:wp="http://schemas.openxmlformats.org/drawingml/2006/wordprocessingDrawing" xmlns:w10="urn:schemas-microsoft-com:office:word" xmlns:w="http://schemas.openxmlformats.org/wordprocessingml/2006/main" xmlns:w14="http://schemas.microsoft.com/office/word/2010/wordml" xmlns:w15="http://schemas.microsoft.com/office/word/2012/wordml" xmlns:w16cex="http://schemas.microsoft.com/office/word/2018/wordml/cex" xmlns:w16cid="http://schemas.microsoft.com/office/word/2016/wordml/cid" xmlns:w16="http://schemas.microsoft.com/office/word/2018/wordml" xmlns:w16du="http://schemas.microsoft.com/office/word/2023/wordml/word16du" xmlns:w16sdtdh="http://schemas.microsoft.com/office/word/2020/wordml/sdtdatahash" xmlns:w16sdtfl="http://schemas.microsoft.com/office/word/2024/wordml/sdtformatlock" xmlns:w16se="http://schemas.microsoft.com/office/word/2015/wordml/symex" xmlns:wpg="http://schemas.microsoft.com/office/word/2010/wordprocessingGroup" xmlns:wpi="http://schemas.microsoft.com/office/word/2010/wordprocessingInk" xmlns:wne="http://schemas.microsoft.com/office/word/2006/wordml" xmlns:wps="http://schemas.microsoft.com/office/word/2010/wordprocessingShape" mc:Ignorable="w14 w15 w16se w16cid w16 w16cex w16sdtdh w16sdtfl w16du wp14">
+  <w:footnote w:type="separator" w:id="-1">
+    <w:p>
+      <w:pPr>
+        <w:spacing w:after="0" w:line="240" w:lineRule="auto"/>
+      </w:pPr>
+      <w:r>
+        <w:separator/>
+      </w:r>
+    </w:p>
+  </w:footnote>
+  <w:footnote w:type="continuationSeparator" w:id="0">
+    <w:p>
+      <w:pPr>
+        <w:spacing w:after="0" w:line="240" w:lineRule="auto"/>
+      </w:pPr>
+      <w:r>
+        <w:continuationSeparator/>
+      </w:r>
+    </w:p>
+  </w:footnote>
+</w:footnotes>
+</file>
+
 <file path=word/header1.xml><?xml version="1.0" encoding="utf-8"?>
-<w:hdr xmlns:o="urn:schemas-microsoft-com:office:office" xmlns:r="http://schemas.openxmlformats.org/officeDocument/2006/relationships" xmlns:v="urn:schemas-microsoft-com:vml" xmlns:w="http://schemas.openxmlformats.org/wordprocessingml/2006/main" xmlns:w10="urn:schemas-microsoft-com:office:word" xmlns:wp="http://schemas.openxmlformats.org/drawingml/2006/wordprocessingDrawing" xmlns:pic="http://schemas.openxmlformats.org/drawingml/2006/picture" xmlns:wps="http://schemas.microsoft.com/office/word/2010/wordprocessingShape" xmlns:wpg="http://schemas.microsoft.com/office/word/2010/wordprocessingGroup" xmlns:mc="http://schemas.openxmlformats.org/markup-compatibility/2006" xmlns:wp14="http://schemas.microsoft.com/office/word/2010/wordprocessingDrawing" xmlns:w14="http://schemas.microsoft.com/office/word/2010/wordml" xmlns:w15="http://schemas.microsoft.com/office/word/2012/wordml" mc:Ignorable="w14 wp14 w15">
+<w:hdr xmlns:wpc="http://schemas.microsoft.com/office/word/2010/wordprocessingCanvas" xmlns:cx="http://schemas.microsoft.com/office/drawing/2014/chartex" xmlns:cx1="http://schemas.microsoft.com/office/drawing/2015/9/8/chartex" xmlns:cx2="http://schemas.microsoft.com/office/drawing/2015/10/21/chartex" xmlns:cx3="http://schemas.microsoft.com/office/drawing/2016/5/9/chartex" xmlns:cx4="http://schemas.microsoft.com/office/drawing/2016/5/10/chartex" xmlns:cx5="http://schemas.microsoft.com/office/drawing/2016/5/11/chartex" xmlns:cx6="http://schemas.microsoft.com/office/drawing/2016/5/12/chartex" xmlns:cx7="http://schemas.microsoft.com/office/drawing/2016/5/13/chartex" xmlns:cx8="http://schemas.microsoft.com/office/drawing/2016/5/14/chartex" xmlns:mc="http://schemas.openxmlformats.org/markup-compatibility/2006" xmlns:aink="http://schemas.microsoft.com/office/drawing/2016/ink" xmlns:am3d="http://schemas.microsoft.com/office/drawing/2017/model3d" xmlns:o="urn:schemas-microsoft-com:office:office" xmlns:oel="http://schemas.microsoft.com/office/2019/extlst" xmlns:r="http://schemas.openxmlformats.org/officeDocument/2006/relationships" xmlns:m="http://schemas.openxmlformats.org/officeDocument/2006/math" xmlns:v="urn:schemas-microsoft-com:vml" xmlns:wp14="http://schemas.microsoft.com/office/word/2010/wordprocessingDrawing" xmlns:wp="http://schemas.openxmlformats.org/drawingml/2006/wordprocessingDrawing" xmlns:w10="urn:schemas-microsoft-com:office:word" xmlns:w="http://schemas.openxmlformats.org/wordprocessingml/2006/main" xmlns:w14="http://schemas.microsoft.com/office/word/2010/wordml" xmlns:w15="http://schemas.microsoft.com/office/word/2012/wordml" xmlns:w16cex="http://schemas.microsoft.com/office/word/2018/wordml/cex" xmlns:w16cid="http://schemas.microsoft.com/office/word/2016/wordml/cid" xmlns:w16="http://schemas.microsoft.com/office/word/2018/wordml" xmlns:w16du="http://schemas.microsoft.com/office/word/2023/wordml/word16du" xmlns:w16sdtdh="http://schemas.microsoft.com/office/word/2020/wordml/sdtdatahash" xmlns:w16sdtfl="http://schemas.microsoft.com/office/word/2024/wordml/sdtformatlock" xmlns:w16se="http://schemas.microsoft.com/office/word/2015/wordml/symex" xmlns:wpg="http://schemas.microsoft.com/office/word/2010/wordprocessingGroup" xmlns:wpi="http://schemas.microsoft.com/office/word/2010/wordprocessingInk" xmlns:wne="http://schemas.microsoft.com/office/word/2006/wordml" xmlns:wps="http://schemas.microsoft.com/office/word/2010/wordprocessingShape" mc:Ignorable="w14 w15 w16se w16cid w16 w16cex w16sdtdh w16sdtfl w16du wp14">
   <w:p>
     <w:pPr>
-      <w:pStyle w:val="Normal"/>
-      <w:spacing w:lineRule="auto" w:line="259" w:before="0" w:after="0"/>
-      <w:ind w:hanging="0" w:left="0" w:right="106"/>
+      <w:spacing w:after="0" w:line="259" w:lineRule="auto"/>
+      <w:ind w:left="0" w:right="106" w:firstLine="0"/>
       <w:jc w:val="right"/>
-      <w:rPr/>
     </w:pPr>
     <w:r>
+      <w:rPr>
+        <w:noProof/>
+      </w:rPr>
       <w:drawing>
-        <wp:anchor behindDoc="1" distT="0" distB="0" distL="114300" distR="114300" simplePos="0" locked="0" layoutInCell="1" allowOverlap="0" relativeHeight="0">
+        <wp:anchor distT="0" distB="0" distL="114300" distR="114300" simplePos="0" relativeHeight="251658240" behindDoc="1" locked="0" layoutInCell="1" allowOverlap="0">
           <wp:simplePos x="0" y="0"/>
           <wp:positionH relativeFrom="page">
             <wp:posOffset>914400</wp:posOffset>
@@ -1244,7 +1171,7 @@
           <wp:extent cx="5845810" cy="600710"/>
           <wp:effectExtent l="0" t="0" r="0" b="0"/>
           <wp:wrapSquare wrapText="bothSides"/>
-          <wp:docPr id="11" name="Picture 204" descr=""/>
+          <wp:docPr id="11" name="Picture 204"/>
           <wp:cNvGraphicFramePr>
             <a:graphicFrameLocks xmlns:a="http://schemas.openxmlformats.org/drawingml/2006/main" noChangeAspect="1"/>
           </wp:cNvGraphicFramePr>
@@ -1252,7 +1179,7 @@
             <a:graphicData uri="http://schemas.openxmlformats.org/drawingml/2006/picture">
               <pic:pic xmlns:pic="http://schemas.openxmlformats.org/drawingml/2006/picture">
                 <pic:nvPicPr>
-                  <pic:cNvPr id="11" name="Picture 204" descr=""/>
+                  <pic:cNvPr id="11" name="Picture 204"/>
                   <pic:cNvPicPr>
                     <a:picLocks noChangeAspect="1" noChangeArrowheads="1"/>
                   </pic:cNvPicPr>
@@ -1280,21 +1207,19 @@
     </w:r>
     <w:r>
       <w:rPr>
-        <w:rFonts w:eastAsia="Calibri" w:cs="Calibri" w:ascii="Calibri" w:hAnsi="Calibri"/>
+        <w:rFonts w:ascii="Calibri" w:eastAsia="Calibri" w:hAnsi="Calibri" w:cs="Calibri"/>
       </w:rPr>
       <w:t xml:space="preserve"> </w:t>
     </w:r>
   </w:p>
   <w:p>
     <w:pPr>
-      <w:pStyle w:val="Normal"/>
-      <w:spacing w:lineRule="auto" w:line="259" w:before="0" w:after="0"/>
-      <w:ind w:hanging="0" w:left="0"/>
-      <w:rPr/>
+      <w:spacing w:after="0" w:line="259" w:lineRule="auto"/>
+      <w:ind w:left="0" w:firstLine="0"/>
     </w:pPr>
     <w:r>
       <w:rPr>
-        <w:rFonts w:eastAsia="Calibri" w:cs="Calibri" w:ascii="Calibri" w:hAnsi="Calibri"/>
+        <w:rFonts w:ascii="Calibri" w:eastAsia="Calibri" w:hAnsi="Calibri" w:cs="Calibri"/>
       </w:rPr>
       <w:t xml:space="preserve"> </w:t>
     </w:r>
@@ -1303,39 +1228,52 @@
 </file>
 
 <file path=word/header2.xml><?xml version="1.0" encoding="utf-8"?>
-<w:hdr xmlns:o="urn:schemas-microsoft-com:office:office" xmlns:r="http://schemas.openxmlformats.org/officeDocument/2006/relationships" xmlns:v="urn:schemas-microsoft-com:vml" xmlns:w="http://schemas.openxmlformats.org/wordprocessingml/2006/main" xmlns:w10="urn:schemas-microsoft-com:office:word" xmlns:wp="http://schemas.openxmlformats.org/drawingml/2006/wordprocessingDrawing" xmlns:pic="http://schemas.openxmlformats.org/drawingml/2006/picture" xmlns:wps="http://schemas.microsoft.com/office/word/2010/wordprocessingShape" xmlns:wpg="http://schemas.microsoft.com/office/word/2010/wordprocessingGroup" xmlns:mc="http://schemas.openxmlformats.org/markup-compatibility/2006" xmlns:wp14="http://schemas.microsoft.com/office/word/2010/wordprocessingDrawing" xmlns:w14="http://schemas.microsoft.com/office/word/2010/wordml" xmlns:w15="http://schemas.microsoft.com/office/word/2012/wordml" mc:Ignorable="w14 wp14 w15">
+<w:hdr xmlns:wpc="http://schemas.microsoft.com/office/word/2010/wordprocessingCanvas" xmlns:cx="http://schemas.microsoft.com/office/drawing/2014/chartex" xmlns:cx1="http://schemas.microsoft.com/office/drawing/2015/9/8/chartex" xmlns:cx2="http://schemas.microsoft.com/office/drawing/2015/10/21/chartex" xmlns:cx3="http://schemas.microsoft.com/office/drawing/2016/5/9/chartex" xmlns:cx4="http://schemas.microsoft.com/office/drawing/2016/5/10/chartex" xmlns:cx5="http://schemas.microsoft.com/office/drawing/2016/5/11/chartex" xmlns:cx6="http://schemas.microsoft.com/office/drawing/2016/5/12/chartex" xmlns:cx7="http://schemas.microsoft.com/office/drawing/2016/5/13/chartex" xmlns:cx8="http://schemas.microsoft.com/office/drawing/2016/5/14/chartex" xmlns:mc="http://schemas.openxmlformats.org/markup-compatibility/2006" xmlns:aink="http://schemas.microsoft.com/office/drawing/2016/ink" xmlns:am3d="http://schemas.microsoft.com/office/drawing/2017/model3d" xmlns:o="urn:schemas-microsoft-com:office:office" xmlns:oel="http://schemas.microsoft.com/office/2019/extlst" xmlns:r="http://schemas.openxmlformats.org/officeDocument/2006/relationships" xmlns:m="http://schemas.openxmlformats.org/officeDocument/2006/math" xmlns:v="urn:schemas-microsoft-com:vml" xmlns:wp14="http://schemas.microsoft.com/office/word/2010/wordprocessingDrawing" xmlns:wp="http://schemas.openxmlformats.org/drawingml/2006/wordprocessingDrawing" xmlns:w10="urn:schemas-microsoft-com:office:word" xmlns:w="http://schemas.openxmlformats.org/wordprocessingml/2006/main" xmlns:w14="http://schemas.microsoft.com/office/word/2010/wordml" xmlns:w15="http://schemas.microsoft.com/office/word/2012/wordml" xmlns:w16cex="http://schemas.microsoft.com/office/word/2018/wordml/cex" xmlns:w16cid="http://schemas.microsoft.com/office/word/2016/wordml/cid" xmlns:w16="http://schemas.microsoft.com/office/word/2018/wordml" xmlns:w16du="http://schemas.microsoft.com/office/word/2023/wordml/word16du" xmlns:w16sdtdh="http://schemas.microsoft.com/office/word/2020/wordml/sdtdatahash" xmlns:w16sdtfl="http://schemas.microsoft.com/office/word/2024/wordml/sdtformatlock" xmlns:w16se="http://schemas.microsoft.com/office/word/2015/wordml/symex" xmlns:wpg="http://schemas.microsoft.com/office/word/2010/wordprocessingGroup" xmlns:wpi="http://schemas.microsoft.com/office/word/2010/wordprocessingInk" xmlns:wne="http://schemas.microsoft.com/office/word/2006/wordml" xmlns:wps="http://schemas.microsoft.com/office/word/2010/wordprocessingShape" mc:Ignorable="w14 w15 w16se w16cid w16 w16cex w16sdtdh w16sdtfl w16du wp14">
   <w:p>
     <w:pPr>
-      <w:pStyle w:val="Normal"/>
-      <w:spacing w:lineRule="auto" w:line="259" w:before="0" w:after="0"/>
-      <w:ind w:hanging="0" w:left="0" w:right="106"/>
+      <w:spacing w:after="0" w:line="259" w:lineRule="auto"/>
+      <w:ind w:left="0" w:right="106" w:firstLine="0"/>
       <w:jc w:val="right"/>
-      <w:rPr/>
     </w:pPr>
     <w:r>
       <w:rPr>
         <w:b/>
         <w:bCs/>
       </w:rPr>
-      <w:t>EENG 498: Install Vitis</w:t>
+      <w:t>EENG 48</w:t>
+    </w:r>
+    <w:r>
+      <w:rPr>
+        <w:b/>
+        <w:bCs/>
+      </w:rPr>
+      <w:t>4</w:t>
+    </w:r>
+    <w:r>
+      <w:rPr>
+        <w:b/>
+        <w:bCs/>
+      </w:rPr>
+      <w:t>: Install Vitis</w:t>
     </w:r>
   </w:p>
 </w:hdr>
 </file>
 
 <file path=word/header3.xml><?xml version="1.0" encoding="utf-8"?>
-<w:hdr xmlns:o="urn:schemas-microsoft-com:office:office" xmlns:r="http://schemas.openxmlformats.org/officeDocument/2006/relationships" xmlns:v="urn:schemas-microsoft-com:vml" xmlns:w="http://schemas.openxmlformats.org/wordprocessingml/2006/main" xmlns:w10="urn:schemas-microsoft-com:office:word" xmlns:wp="http://schemas.openxmlformats.org/drawingml/2006/wordprocessingDrawing" xmlns:pic="http://schemas.openxmlformats.org/drawingml/2006/picture" xmlns:wps="http://schemas.microsoft.com/office/word/2010/wordprocessingShape" xmlns:wpg="http://schemas.microsoft.com/office/word/2010/wordprocessingGroup" xmlns:mc="http://schemas.openxmlformats.org/markup-compatibility/2006" xmlns:wp14="http://schemas.microsoft.com/office/word/2010/wordprocessingDrawing" xmlns:w14="http://schemas.microsoft.com/office/word/2010/wordml" xmlns:w15="http://schemas.microsoft.com/office/word/2012/wordml" mc:Ignorable="w14 wp14 w15">
+<w:hdr xmlns:wpc="http://schemas.microsoft.com/office/word/2010/wordprocessingCanvas" xmlns:cx="http://schemas.microsoft.com/office/drawing/2014/chartex" xmlns:cx1="http://schemas.microsoft.com/office/drawing/2015/9/8/chartex" xmlns:cx2="http://schemas.microsoft.com/office/drawing/2015/10/21/chartex" xmlns:cx3="http://schemas.microsoft.com/office/drawing/2016/5/9/chartex" xmlns:cx4="http://schemas.microsoft.com/office/drawing/2016/5/10/chartex" xmlns:cx5="http://schemas.microsoft.com/office/drawing/2016/5/11/chartex" xmlns:cx6="http://schemas.microsoft.com/office/drawing/2016/5/12/chartex" xmlns:cx7="http://schemas.microsoft.com/office/drawing/2016/5/13/chartex" xmlns:cx8="http://schemas.microsoft.com/office/drawing/2016/5/14/chartex" xmlns:mc="http://schemas.openxmlformats.org/markup-compatibility/2006" xmlns:aink="http://schemas.microsoft.com/office/drawing/2016/ink" xmlns:am3d="http://schemas.microsoft.com/office/drawing/2017/model3d" xmlns:o="urn:schemas-microsoft-com:office:office" xmlns:oel="http://schemas.microsoft.com/office/2019/extlst" xmlns:r="http://schemas.openxmlformats.org/officeDocument/2006/relationships" xmlns:m="http://schemas.openxmlformats.org/officeDocument/2006/math" xmlns:v="urn:schemas-microsoft-com:vml" xmlns:wp14="http://schemas.microsoft.com/office/word/2010/wordprocessingDrawing" xmlns:wp="http://schemas.openxmlformats.org/drawingml/2006/wordprocessingDrawing" xmlns:w10="urn:schemas-microsoft-com:office:word" xmlns:w="http://schemas.openxmlformats.org/wordprocessingml/2006/main" xmlns:w14="http://schemas.microsoft.com/office/word/2010/wordml" xmlns:w15="http://schemas.microsoft.com/office/word/2012/wordml" xmlns:w16cex="http://schemas.microsoft.com/office/word/2018/wordml/cex" xmlns:w16cid="http://schemas.microsoft.com/office/word/2016/wordml/cid" xmlns:w16="http://schemas.microsoft.com/office/word/2018/wordml" xmlns:w16du="http://schemas.microsoft.com/office/word/2023/wordml/word16du" xmlns:w16sdtdh="http://schemas.microsoft.com/office/word/2020/wordml/sdtdatahash" xmlns:w16sdtfl="http://schemas.microsoft.com/office/word/2024/wordml/sdtformatlock" xmlns:w16se="http://schemas.microsoft.com/office/word/2015/wordml/symex" xmlns:wpg="http://schemas.microsoft.com/office/word/2010/wordprocessingGroup" xmlns:wpi="http://schemas.microsoft.com/office/word/2010/wordprocessingInk" xmlns:wne="http://schemas.microsoft.com/office/word/2006/wordml" xmlns:wps="http://schemas.microsoft.com/office/word/2010/wordprocessingShape" mc:Ignorable="w14 w15 w16se w16cid w16 w16cex w16sdtdh w16sdtfl w16du wp14">
   <w:p>
     <w:pPr>
-      <w:pStyle w:val="Normal"/>
-      <w:spacing w:lineRule="auto" w:line="259" w:before="0" w:after="0"/>
-      <w:ind w:hanging="0" w:left="0" w:right="106"/>
+      <w:spacing w:after="0" w:line="259" w:lineRule="auto"/>
+      <w:ind w:left="0" w:right="106" w:firstLine="0"/>
       <w:jc w:val="right"/>
-      <w:rPr/>
     </w:pPr>
     <w:r>
+      <w:rPr>
+        <w:noProof/>
+      </w:rPr>
       <w:drawing>
-        <wp:anchor behindDoc="1" distT="0" distB="0" distL="114300" distR="114300" simplePos="0" locked="0" layoutInCell="0" allowOverlap="0" relativeHeight="11">
+        <wp:anchor distT="0" distB="0" distL="114300" distR="114300" simplePos="0" relativeHeight="11" behindDoc="1" locked="0" layoutInCell="0" allowOverlap="0">
           <wp:simplePos x="0" y="0"/>
           <wp:positionH relativeFrom="page">
             <wp:posOffset>914400</wp:posOffset>
@@ -1346,7 +1284,7 @@
           <wp:extent cx="5845810" cy="600710"/>
           <wp:effectExtent l="0" t="0" r="0" b="0"/>
           <wp:wrapSquare wrapText="bothSides"/>
-          <wp:docPr id="12" name="Picture 7" descr=""/>
+          <wp:docPr id="12" name="Picture 7"/>
           <wp:cNvGraphicFramePr>
             <a:graphicFrameLocks xmlns:a="http://schemas.openxmlformats.org/drawingml/2006/main" noChangeAspect="1"/>
           </wp:cNvGraphicFramePr>
@@ -1354,7 +1292,7 @@
             <a:graphicData uri="http://schemas.openxmlformats.org/drawingml/2006/picture">
               <pic:pic xmlns:pic="http://schemas.openxmlformats.org/drawingml/2006/picture">
                 <pic:nvPicPr>
-                  <pic:cNvPr id="12" name="Picture 7" descr=""/>
+                  <pic:cNvPr id="12" name="Picture 7"/>
                   <pic:cNvPicPr>
                     <a:picLocks noChangeAspect="1" noChangeArrowheads="1"/>
                   </pic:cNvPicPr>
@@ -1383,7 +1321,7 @@
     </w:r>
     <w:r>
       <w:rPr>
-        <w:rFonts w:eastAsia="Calibri" w:cs="Calibri" w:ascii="Calibri" w:hAnsi="Calibri"/>
+        <w:rFonts w:ascii="Calibri" w:eastAsia="Calibri" w:hAnsi="Calibri" w:cs="Calibri"/>
       </w:rPr>
       <w:t xml:space="preserve"> </w:t>
     </w:r>
@@ -1392,8 +1330,11 @@
 </file>
 
 <file path=word/numbering.xml><?xml version="1.0" encoding="utf-8"?>
-<w:numbering xmlns:w="http://schemas.openxmlformats.org/wordprocessingml/2006/main" xmlns:o="urn:schemas-microsoft-com:office:office" xmlns:r="http://schemas.openxmlformats.org/officeDocument/2006/relationships" xmlns:v="urn:schemas-microsoft-com:vml" xmlns:mc="http://schemas.openxmlformats.org/markup-compatibility/2006" xmlns:w14="http://schemas.microsoft.com/office/word/2010/wordml" mc:Ignorable="w14">
-  <w:abstractNum w:abstractNumId="1">
+<w:numbering xmlns:wpc="http://schemas.microsoft.com/office/word/2010/wordprocessingCanvas" xmlns:cx="http://schemas.microsoft.com/office/drawing/2014/chartex" xmlns:cx1="http://schemas.microsoft.com/office/drawing/2015/9/8/chartex" xmlns:cx2="http://schemas.microsoft.com/office/drawing/2015/10/21/chartex" xmlns:cx3="http://schemas.microsoft.com/office/drawing/2016/5/9/chartex" xmlns:cx4="http://schemas.microsoft.com/office/drawing/2016/5/10/chartex" xmlns:cx5="http://schemas.microsoft.com/office/drawing/2016/5/11/chartex" xmlns:cx6="http://schemas.microsoft.com/office/drawing/2016/5/12/chartex" xmlns:cx7="http://schemas.microsoft.com/office/drawing/2016/5/13/chartex" xmlns:cx8="http://schemas.microsoft.com/office/drawing/2016/5/14/chartex" xmlns:mc="http://schemas.openxmlformats.org/markup-compatibility/2006" xmlns:aink="http://schemas.microsoft.com/office/drawing/2016/ink" xmlns:am3d="http://schemas.microsoft.com/office/drawing/2017/model3d" xmlns:o="urn:schemas-microsoft-com:office:office" xmlns:oel="http://schemas.microsoft.com/office/2019/extlst" xmlns:r="http://schemas.openxmlformats.org/officeDocument/2006/relationships" xmlns:m="http://schemas.openxmlformats.org/officeDocument/2006/math" xmlns:v="urn:schemas-microsoft-com:vml" xmlns:wp14="http://schemas.microsoft.com/office/word/2010/wordprocessingDrawing" xmlns:wp="http://schemas.openxmlformats.org/drawingml/2006/wordprocessingDrawing" xmlns:w10="urn:schemas-microsoft-com:office:word" xmlns:w="http://schemas.openxmlformats.org/wordprocessingml/2006/main" xmlns:w14="http://schemas.microsoft.com/office/word/2010/wordml" xmlns:w15="http://schemas.microsoft.com/office/word/2012/wordml" xmlns:w16cex="http://schemas.microsoft.com/office/word/2018/wordml/cex" xmlns:w16cid="http://schemas.microsoft.com/office/word/2016/wordml/cid" xmlns:w16="http://schemas.microsoft.com/office/word/2018/wordml" xmlns:w16du="http://schemas.microsoft.com/office/word/2023/wordml/word16du" xmlns:w16sdtdh="http://schemas.microsoft.com/office/word/2020/wordml/sdtdatahash" xmlns:w16sdtfl="http://schemas.microsoft.com/office/word/2024/wordml/sdtformatlock" xmlns:w16se="http://schemas.microsoft.com/office/word/2015/wordml/symex" xmlns:wpg="http://schemas.microsoft.com/office/word/2010/wordprocessingGroup" xmlns:wpi="http://schemas.microsoft.com/office/word/2010/wordprocessingInk" xmlns:wne="http://schemas.microsoft.com/office/word/2006/wordml" xmlns:wps="http://schemas.microsoft.com/office/word/2010/wordprocessingShape" mc:Ignorable="w14 w15 w16se w16cid w16 w16cex w16sdtdh w16sdtfl w16du wp14">
+  <w:abstractNum w:abstractNumId="0" w15:restartNumberingAfterBreak="0">
+    <w:nsid w:val="1A765CB8"/>
+    <w:multiLevelType w:val="multilevel"/>
+    <w:tmpl w:val="C62E519A"/>
     <w:lvl w:ilvl="0">
       <w:start w:val="1"/>
       <w:numFmt w:val="none"/>
@@ -1404,7 +1345,7 @@
         <w:tabs>
           <w:tab w:val="num" w:pos="0"/>
         </w:tabs>
-        <w:ind w:left="0" w:hanging="0"/>
+        <w:ind w:left="0" w:firstLine="0"/>
       </w:pPr>
     </w:lvl>
     <w:lvl w:ilvl="1">
@@ -1417,7 +1358,7 @@
         <w:tabs>
           <w:tab w:val="num" w:pos="0"/>
         </w:tabs>
-        <w:ind w:left="0" w:hanging="0"/>
+        <w:ind w:left="0" w:firstLine="0"/>
       </w:pPr>
     </w:lvl>
     <w:lvl w:ilvl="2">
@@ -1430,7 +1371,7 @@
         <w:tabs>
           <w:tab w:val="num" w:pos="0"/>
         </w:tabs>
-        <w:ind w:left="0" w:hanging="0"/>
+        <w:ind w:left="0" w:firstLine="0"/>
       </w:pPr>
     </w:lvl>
     <w:lvl w:ilvl="3">
@@ -1443,7 +1384,7 @@
         <w:tabs>
           <w:tab w:val="num" w:pos="0"/>
         </w:tabs>
-        <w:ind w:left="0" w:hanging="0"/>
+        <w:ind w:left="0" w:firstLine="0"/>
       </w:pPr>
     </w:lvl>
     <w:lvl w:ilvl="4">
@@ -1456,7 +1397,7 @@
         <w:tabs>
           <w:tab w:val="num" w:pos="0"/>
         </w:tabs>
-        <w:ind w:left="0" w:hanging="0"/>
+        <w:ind w:left="0" w:firstLine="0"/>
       </w:pPr>
     </w:lvl>
     <w:lvl w:ilvl="5">
@@ -1469,7 +1410,7 @@
         <w:tabs>
           <w:tab w:val="num" w:pos="0"/>
         </w:tabs>
-        <w:ind w:left="0" w:hanging="0"/>
+        <w:ind w:left="0" w:firstLine="0"/>
       </w:pPr>
     </w:lvl>
     <w:lvl w:ilvl="6">
@@ -1482,7 +1423,7 @@
         <w:tabs>
           <w:tab w:val="num" w:pos="0"/>
         </w:tabs>
-        <w:ind w:left="0" w:hanging="0"/>
+        <w:ind w:left="0" w:firstLine="0"/>
       </w:pPr>
     </w:lvl>
     <w:lvl w:ilvl="7">
@@ -1495,7 +1436,7 @@
         <w:tabs>
           <w:tab w:val="num" w:pos="0"/>
         </w:tabs>
-        <w:ind w:left="0" w:hanging="0"/>
+        <w:ind w:left="0" w:firstLine="0"/>
       </w:pPr>
     </w:lvl>
     <w:lvl w:ilvl="8">
@@ -1508,11 +1449,154 @@
         <w:tabs>
           <w:tab w:val="num" w:pos="0"/>
         </w:tabs>
-        <w:ind w:left="0" w:hanging="0"/>
+        <w:ind w:left="0" w:firstLine="0"/>
       </w:pPr>
     </w:lvl>
   </w:abstractNum>
-  <w:abstractNum w:abstractNumId="2">
+  <w:abstractNum w:abstractNumId="1" w15:restartNumberingAfterBreak="0">
+    <w:nsid w:val="1D0C162D"/>
+    <w:multiLevelType w:val="multilevel"/>
+    <w:tmpl w:val="EC32D4AC"/>
+    <w:lvl w:ilvl="0">
+      <w:start w:val="1"/>
+      <w:numFmt w:val="bullet"/>
+      <w:lvlText w:val=""/>
+      <w:lvlJc w:val="left"/>
+      <w:pPr>
+        <w:tabs>
+          <w:tab w:val="num" w:pos="720"/>
+        </w:tabs>
+        <w:ind w:left="720" w:hanging="360"/>
+      </w:pPr>
+      <w:rPr>
+        <w:rFonts w:ascii="Symbol" w:hAnsi="Symbol" w:cs="Symbol" w:hint="default"/>
+      </w:rPr>
+    </w:lvl>
+    <w:lvl w:ilvl="1">
+      <w:start w:val="1"/>
+      <w:numFmt w:val="bullet"/>
+      <w:lvlText w:val=""/>
+      <w:lvlJc w:val="left"/>
+      <w:pPr>
+        <w:tabs>
+          <w:tab w:val="num" w:pos="1080"/>
+        </w:tabs>
+        <w:ind w:left="1080" w:hanging="360"/>
+      </w:pPr>
+      <w:rPr>
+        <w:rFonts w:ascii="Symbol" w:hAnsi="Symbol" w:cs="Symbol" w:hint="default"/>
+      </w:rPr>
+    </w:lvl>
+    <w:lvl w:ilvl="2">
+      <w:start w:val="1"/>
+      <w:numFmt w:val="bullet"/>
+      <w:lvlText w:val=""/>
+      <w:lvlJc w:val="left"/>
+      <w:pPr>
+        <w:tabs>
+          <w:tab w:val="num" w:pos="1440"/>
+        </w:tabs>
+        <w:ind w:left="1440" w:hanging="360"/>
+      </w:pPr>
+      <w:rPr>
+        <w:rFonts w:ascii="Symbol" w:hAnsi="Symbol" w:cs="Symbol" w:hint="default"/>
+      </w:rPr>
+    </w:lvl>
+    <w:lvl w:ilvl="3">
+      <w:start w:val="1"/>
+      <w:numFmt w:val="bullet"/>
+      <w:lvlText w:val=""/>
+      <w:lvlJc w:val="left"/>
+      <w:pPr>
+        <w:tabs>
+          <w:tab w:val="num" w:pos="1800"/>
+        </w:tabs>
+        <w:ind w:left="1800" w:hanging="360"/>
+      </w:pPr>
+      <w:rPr>
+        <w:rFonts w:ascii="Symbol" w:hAnsi="Symbol" w:cs="Symbol" w:hint="default"/>
+      </w:rPr>
+    </w:lvl>
+    <w:lvl w:ilvl="4">
+      <w:start w:val="1"/>
+      <w:numFmt w:val="bullet"/>
+      <w:lvlText w:val=""/>
+      <w:lvlJc w:val="left"/>
+      <w:pPr>
+        <w:tabs>
+          <w:tab w:val="num" w:pos="2160"/>
+        </w:tabs>
+        <w:ind w:left="2160" w:hanging="360"/>
+      </w:pPr>
+      <w:rPr>
+        <w:rFonts w:ascii="Symbol" w:hAnsi="Symbol" w:cs="Symbol" w:hint="default"/>
+      </w:rPr>
+    </w:lvl>
+    <w:lvl w:ilvl="5">
+      <w:start w:val="1"/>
+      <w:numFmt w:val="bullet"/>
+      <w:lvlText w:val=""/>
+      <w:lvlJc w:val="left"/>
+      <w:pPr>
+        <w:tabs>
+          <w:tab w:val="num" w:pos="2520"/>
+        </w:tabs>
+        <w:ind w:left="2520" w:hanging="360"/>
+      </w:pPr>
+      <w:rPr>
+        <w:rFonts w:ascii="Symbol" w:hAnsi="Symbol" w:cs="Symbol" w:hint="default"/>
+      </w:rPr>
+    </w:lvl>
+    <w:lvl w:ilvl="6">
+      <w:start w:val="1"/>
+      <w:numFmt w:val="bullet"/>
+      <w:lvlText w:val=""/>
+      <w:lvlJc w:val="left"/>
+      <w:pPr>
+        <w:tabs>
+          <w:tab w:val="num" w:pos="2880"/>
+        </w:tabs>
+        <w:ind w:left="2880" w:hanging="360"/>
+      </w:pPr>
+      <w:rPr>
+        <w:rFonts w:ascii="Symbol" w:hAnsi="Symbol" w:cs="Symbol" w:hint="default"/>
+      </w:rPr>
+    </w:lvl>
+    <w:lvl w:ilvl="7">
+      <w:start w:val="1"/>
+      <w:numFmt w:val="bullet"/>
+      <w:lvlText w:val=""/>
+      <w:lvlJc w:val="left"/>
+      <w:pPr>
+        <w:tabs>
+          <w:tab w:val="num" w:pos="3240"/>
+        </w:tabs>
+        <w:ind w:left="3240" w:hanging="360"/>
+      </w:pPr>
+      <w:rPr>
+        <w:rFonts w:ascii="Symbol" w:hAnsi="Symbol" w:cs="Symbol" w:hint="default"/>
+      </w:rPr>
+    </w:lvl>
+    <w:lvl w:ilvl="8">
+      <w:start w:val="1"/>
+      <w:numFmt w:val="bullet"/>
+      <w:lvlText w:val=""/>
+      <w:lvlJc w:val="left"/>
+      <w:pPr>
+        <w:tabs>
+          <w:tab w:val="num" w:pos="3600"/>
+        </w:tabs>
+        <w:ind w:left="3600" w:hanging="360"/>
+      </w:pPr>
+      <w:rPr>
+        <w:rFonts w:ascii="Symbol" w:hAnsi="Symbol" w:cs="Symbol" w:hint="default"/>
+      </w:rPr>
+    </w:lvl>
+  </w:abstractNum>
+  <w:abstractNum w:abstractNumId="2" w15:restartNumberingAfterBreak="0">
+    <w:nsid w:val="49E06C6B"/>
+    <w:multiLevelType w:val="multilevel"/>
+    <w:tmpl w:val="22DC9D70"/>
     <w:lvl w:ilvl="0">
       <w:start w:val="1"/>
       <w:numFmt w:val="decimal"/>
@@ -1524,7 +1608,6 @@
         </w:tabs>
         <w:ind w:left="720" w:hanging="360"/>
       </w:pPr>
-      <w:rPr/>
     </w:lvl>
     <w:lvl w:ilvl="1">
       <w:start w:val="1"/>
@@ -1537,7 +1620,6 @@
         </w:tabs>
         <w:ind w:left="1440" w:hanging="360"/>
       </w:pPr>
-      <w:rPr/>
     </w:lvl>
     <w:lvl w:ilvl="2">
       <w:start w:val="1"/>
@@ -1550,7 +1632,6 @@
         </w:tabs>
         <w:ind w:left="2160" w:hanging="180"/>
       </w:pPr>
-      <w:rPr/>
     </w:lvl>
     <w:lvl w:ilvl="3">
       <w:start w:val="1"/>
@@ -1563,7 +1644,6 @@
         </w:tabs>
         <w:ind w:left="2880" w:hanging="360"/>
       </w:pPr>
-      <w:rPr/>
     </w:lvl>
     <w:lvl w:ilvl="4">
       <w:start w:val="1"/>
@@ -1576,7 +1656,6 @@
         </w:tabs>
         <w:ind w:left="3600" w:hanging="360"/>
       </w:pPr>
-      <w:rPr/>
     </w:lvl>
     <w:lvl w:ilvl="5">
       <w:start w:val="1"/>
@@ -1589,7 +1668,6 @@
         </w:tabs>
         <w:ind w:left="4320" w:hanging="180"/>
       </w:pPr>
-      <w:rPr/>
     </w:lvl>
     <w:lvl w:ilvl="6">
       <w:start w:val="1"/>
@@ -1602,7 +1680,6 @@
         </w:tabs>
         <w:ind w:left="5040" w:hanging="360"/>
       </w:pPr>
-      <w:rPr/>
     </w:lvl>
     <w:lvl w:ilvl="7">
       <w:start w:val="1"/>
@@ -1615,7 +1692,6 @@
         </w:tabs>
         <w:ind w:left="5760" w:hanging="360"/>
       </w:pPr>
-      <w:rPr/>
     </w:lvl>
     <w:lvl w:ilvl="8">
       <w:start w:val="1"/>
@@ -1628,164 +1704,26 @@
         </w:tabs>
         <w:ind w:left="6480" w:hanging="180"/>
       </w:pPr>
-      <w:rPr/>
     </w:lvl>
   </w:abstractNum>
-  <w:abstractNum w:abstractNumId="3">
-    <w:lvl w:ilvl="0">
-      <w:start w:val="1"/>
-      <w:numFmt w:val="bullet"/>
-      <w:lvlText w:val=""/>
-      <w:lvlJc w:val="left"/>
-      <w:pPr>
-        <w:tabs>
-          <w:tab w:val="num" w:pos="720"/>
-        </w:tabs>
-        <w:ind w:left="720" w:hanging="360"/>
-      </w:pPr>
-      <w:rPr>
-        <w:rFonts w:ascii="Symbol" w:hAnsi="Symbol" w:cs="Symbol" w:hint="default"/>
-      </w:rPr>
-    </w:lvl>
-    <w:lvl w:ilvl="1">
-      <w:start w:val="1"/>
-      <w:numFmt w:val="bullet"/>
-      <w:lvlText w:val=""/>
-      <w:lvlJc w:val="left"/>
-      <w:pPr>
-        <w:tabs>
-          <w:tab w:val="num" w:pos="1080"/>
-        </w:tabs>
-        <w:ind w:left="1080" w:hanging="360"/>
-      </w:pPr>
-      <w:rPr>
-        <w:rFonts w:ascii="Symbol" w:hAnsi="Symbol" w:cs="Symbol" w:hint="default"/>
-      </w:rPr>
-    </w:lvl>
-    <w:lvl w:ilvl="2">
-      <w:start w:val="1"/>
-      <w:numFmt w:val="bullet"/>
-      <w:lvlText w:val=""/>
-      <w:lvlJc w:val="left"/>
-      <w:pPr>
-        <w:tabs>
-          <w:tab w:val="num" w:pos="1440"/>
-        </w:tabs>
-        <w:ind w:left="1440" w:hanging="360"/>
-      </w:pPr>
-      <w:rPr>
-        <w:rFonts w:ascii="Symbol" w:hAnsi="Symbol" w:cs="Symbol" w:hint="default"/>
-      </w:rPr>
-    </w:lvl>
-    <w:lvl w:ilvl="3">
-      <w:start w:val="1"/>
-      <w:numFmt w:val="bullet"/>
-      <w:lvlText w:val=""/>
-      <w:lvlJc w:val="left"/>
-      <w:pPr>
-        <w:tabs>
-          <w:tab w:val="num" w:pos="1800"/>
-        </w:tabs>
-        <w:ind w:left="1800" w:hanging="360"/>
-      </w:pPr>
-      <w:rPr>
-        <w:rFonts w:ascii="Symbol" w:hAnsi="Symbol" w:cs="Symbol" w:hint="default"/>
-      </w:rPr>
-    </w:lvl>
-    <w:lvl w:ilvl="4">
-      <w:start w:val="1"/>
-      <w:numFmt w:val="bullet"/>
-      <w:lvlText w:val=""/>
-      <w:lvlJc w:val="left"/>
-      <w:pPr>
-        <w:tabs>
-          <w:tab w:val="num" w:pos="2160"/>
-        </w:tabs>
-        <w:ind w:left="2160" w:hanging="360"/>
-      </w:pPr>
-      <w:rPr>
-        <w:rFonts w:ascii="Symbol" w:hAnsi="Symbol" w:cs="Symbol" w:hint="default"/>
-      </w:rPr>
-    </w:lvl>
-    <w:lvl w:ilvl="5">
-      <w:start w:val="1"/>
-      <w:numFmt w:val="bullet"/>
-      <w:lvlText w:val=""/>
-      <w:lvlJc w:val="left"/>
-      <w:pPr>
-        <w:tabs>
-          <w:tab w:val="num" w:pos="2520"/>
-        </w:tabs>
-        <w:ind w:left="2520" w:hanging="360"/>
-      </w:pPr>
-      <w:rPr>
-        <w:rFonts w:ascii="Symbol" w:hAnsi="Symbol" w:cs="Symbol" w:hint="default"/>
-      </w:rPr>
-    </w:lvl>
-    <w:lvl w:ilvl="6">
-      <w:start w:val="1"/>
-      <w:numFmt w:val="bullet"/>
-      <w:lvlText w:val=""/>
-      <w:lvlJc w:val="left"/>
-      <w:pPr>
-        <w:tabs>
-          <w:tab w:val="num" w:pos="2880"/>
-        </w:tabs>
-        <w:ind w:left="2880" w:hanging="360"/>
-      </w:pPr>
-      <w:rPr>
-        <w:rFonts w:ascii="Symbol" w:hAnsi="Symbol" w:cs="Symbol" w:hint="default"/>
-      </w:rPr>
-    </w:lvl>
-    <w:lvl w:ilvl="7">
-      <w:start w:val="1"/>
-      <w:numFmt w:val="bullet"/>
-      <w:lvlText w:val=""/>
-      <w:lvlJc w:val="left"/>
-      <w:pPr>
-        <w:tabs>
-          <w:tab w:val="num" w:pos="3240"/>
-        </w:tabs>
-        <w:ind w:left="3240" w:hanging="360"/>
-      </w:pPr>
-      <w:rPr>
-        <w:rFonts w:ascii="Symbol" w:hAnsi="Symbol" w:cs="Symbol" w:hint="default"/>
-      </w:rPr>
-    </w:lvl>
-    <w:lvl w:ilvl="8">
-      <w:start w:val="1"/>
-      <w:numFmt w:val="bullet"/>
-      <w:lvlText w:val=""/>
-      <w:lvlJc w:val="left"/>
-      <w:pPr>
-        <w:tabs>
-          <w:tab w:val="num" w:pos="3600"/>
-        </w:tabs>
-        <w:ind w:left="3600" w:hanging="360"/>
-      </w:pPr>
-      <w:rPr>
-        <w:rFonts w:ascii="Symbol" w:hAnsi="Symbol" w:cs="Symbol" w:hint="default"/>
-      </w:rPr>
-    </w:lvl>
-  </w:abstractNum>
-  <w:num w:numId="1">
-    <w:abstractNumId w:val="1"/>
+  <w:num w:numId="1" w16cid:durableId="1994134867">
+    <w:abstractNumId w:val="0"/>
   </w:num>
-  <w:num w:numId="2">
+  <w:num w:numId="2" w16cid:durableId="633561170">
     <w:abstractNumId w:val="2"/>
   </w:num>
-  <w:num w:numId="3">
-    <w:abstractNumId w:val="3"/>
+  <w:num w:numId="3" w16cid:durableId="60718639">
+    <w:abstractNumId w:val="1"/>
   </w:num>
 </w:numbering>
 </file>
 
 <file path=word/styles.xml><?xml version="1.0" encoding="utf-8"?>
-<w:styles xmlns:w="http://schemas.openxmlformats.org/wordprocessingml/2006/main" xmlns:w14="http://schemas.microsoft.com/office/word/2010/wordml" xmlns:mc="http://schemas.openxmlformats.org/markup-compatibility/2006" mc:Ignorable="w14">
+<w:styles xmlns:mc="http://schemas.openxmlformats.org/markup-compatibility/2006" xmlns:r="http://schemas.openxmlformats.org/officeDocument/2006/relationships" xmlns:w="http://schemas.openxmlformats.org/wordprocessingml/2006/main" xmlns:w14="http://schemas.microsoft.com/office/word/2010/wordml" xmlns:w15="http://schemas.microsoft.com/office/word/2012/wordml" xmlns:w16cex="http://schemas.microsoft.com/office/word/2018/wordml/cex" xmlns:w16cid="http://schemas.microsoft.com/office/word/2016/wordml/cid" xmlns:w16="http://schemas.microsoft.com/office/word/2018/wordml" xmlns:w16du="http://schemas.microsoft.com/office/word/2023/wordml/word16du" xmlns:w16sdtdh="http://schemas.microsoft.com/office/word/2020/wordml/sdtdatahash" xmlns:w16sdtfl="http://schemas.microsoft.com/office/word/2024/wordml/sdtformatlock" xmlns:w16se="http://schemas.microsoft.com/office/word/2015/wordml/symex" mc:Ignorable="w14 w15 w16se w16cid w16 w16cex w16sdtdh w16sdtfl w16du">
   <w:docDefaults>
     <w:rPrDefault>
       <w:rPr>
-        <w:rFonts w:ascii="Calibri" w:hAnsi="Calibri" w:eastAsia="" w:cs="" w:asciiTheme="minorHAnsi" w:cstheme="minorBidi" w:eastAsiaTheme="minorEastAsia" w:hAnsiTheme="minorHAnsi"/>
+        <w:rFonts w:asciiTheme="minorHAnsi" w:eastAsiaTheme="minorEastAsia" w:hAnsiTheme="minorHAnsi" w:cstheme="minorBidi"/>
         <w:sz w:val="22"/>
         <w:szCs w:val="22"/>
         <w:lang w:val="en-US" w:eastAsia="en-US" w:bidi="ar-SA"/>
@@ -1793,21 +1731,21 @@
     </w:rPrDefault>
     <w:pPrDefault>
       <w:pPr>
-        <w:suppressAutoHyphens w:val="true"/>
+        <w:suppressAutoHyphens/>
       </w:pPr>
     </w:pPrDefault>
   </w:docDefaults>
   <w:latentStyles w:defLockedState="0" w:defUIPriority="99" w:defSemiHidden="0" w:defUnhideWhenUsed="0" w:defQFormat="0" w:count="376">
     <w:lsdException w:name="Normal" w:uiPriority="0" w:qFormat="1"/>
     <w:lsdException w:name="heading 1" w:uiPriority="9" w:qFormat="1"/>
-    <w:lsdException w:name="heading 2" w:uiPriority="9" w:semiHidden="1" w:unhideWhenUsed="1" w:qFormat="1"/>
-    <w:lsdException w:name="heading 3" w:uiPriority="9" w:semiHidden="1" w:unhideWhenUsed="1" w:qFormat="1"/>
-    <w:lsdException w:name="heading 4" w:uiPriority="9" w:semiHidden="1" w:unhideWhenUsed="1" w:qFormat="1"/>
-    <w:lsdException w:name="heading 5" w:uiPriority="9" w:semiHidden="1" w:unhideWhenUsed="1" w:qFormat="1"/>
-    <w:lsdException w:name="heading 6" w:uiPriority="9" w:semiHidden="1" w:unhideWhenUsed="1" w:qFormat="1"/>
-    <w:lsdException w:name="heading 7" w:uiPriority="9" w:semiHidden="1" w:unhideWhenUsed="1" w:qFormat="1"/>
-    <w:lsdException w:name="heading 8" w:uiPriority="9" w:semiHidden="1" w:unhideWhenUsed="1" w:qFormat="1"/>
-    <w:lsdException w:name="heading 9" w:uiPriority="9" w:semiHidden="1" w:unhideWhenUsed="1" w:qFormat="1"/>
+    <w:lsdException w:name="heading 2" w:semiHidden="1" w:uiPriority="9" w:unhideWhenUsed="1" w:qFormat="1"/>
+    <w:lsdException w:name="heading 3" w:semiHidden="1" w:uiPriority="9" w:unhideWhenUsed="1" w:qFormat="1"/>
+    <w:lsdException w:name="heading 4" w:semiHidden="1" w:uiPriority="9" w:unhideWhenUsed="1" w:qFormat="1"/>
+    <w:lsdException w:name="heading 5" w:semiHidden="1" w:uiPriority="9" w:unhideWhenUsed="1" w:qFormat="1"/>
+    <w:lsdException w:name="heading 6" w:semiHidden="1" w:uiPriority="9" w:unhideWhenUsed="1" w:qFormat="1"/>
+    <w:lsdException w:name="heading 7" w:semiHidden="1" w:uiPriority="9" w:unhideWhenUsed="1" w:qFormat="1"/>
+    <w:lsdException w:name="heading 8" w:semiHidden="1" w:uiPriority="9" w:unhideWhenUsed="1" w:qFormat="1"/>
+    <w:lsdException w:name="heading 9" w:semiHidden="1" w:uiPriority="9" w:unhideWhenUsed="1" w:qFormat="1"/>
     <w:lsdException w:name="index 1" w:semiHidden="1" w:unhideWhenUsed="1"/>
     <w:lsdException w:name="index 2" w:semiHidden="1" w:unhideWhenUsed="1"/>
     <w:lsdException w:name="index 3" w:semiHidden="1" w:unhideWhenUsed="1"/>
@@ -1817,22 +1755,22 @@
     <w:lsdException w:name="index 7" w:semiHidden="1" w:unhideWhenUsed="1"/>
     <w:lsdException w:name="index 8" w:semiHidden="1" w:unhideWhenUsed="1"/>
     <w:lsdException w:name="index 9" w:semiHidden="1" w:unhideWhenUsed="1"/>
-    <w:lsdException w:name="toc 1" w:uiPriority="39" w:semiHidden="1" w:unhideWhenUsed="1"/>
-    <w:lsdException w:name="toc 2" w:uiPriority="39" w:semiHidden="1" w:unhideWhenUsed="1"/>
-    <w:lsdException w:name="toc 3" w:uiPriority="39" w:semiHidden="1" w:unhideWhenUsed="1"/>
-    <w:lsdException w:name="toc 4" w:uiPriority="39" w:semiHidden="1" w:unhideWhenUsed="1"/>
-    <w:lsdException w:name="toc 5" w:uiPriority="39" w:semiHidden="1" w:unhideWhenUsed="1"/>
-    <w:lsdException w:name="toc 6" w:uiPriority="39" w:semiHidden="1" w:unhideWhenUsed="1"/>
-    <w:lsdException w:name="toc 7" w:uiPriority="39" w:semiHidden="1" w:unhideWhenUsed="1"/>
-    <w:lsdException w:name="toc 8" w:uiPriority="39" w:semiHidden="1" w:unhideWhenUsed="1"/>
-    <w:lsdException w:name="toc 9" w:uiPriority="39" w:semiHidden="1" w:unhideWhenUsed="1"/>
+    <w:lsdException w:name="toc 1" w:semiHidden="1" w:uiPriority="39" w:unhideWhenUsed="1"/>
+    <w:lsdException w:name="toc 2" w:semiHidden="1" w:uiPriority="39" w:unhideWhenUsed="1"/>
+    <w:lsdException w:name="toc 3" w:semiHidden="1" w:uiPriority="39" w:unhideWhenUsed="1"/>
+    <w:lsdException w:name="toc 4" w:semiHidden="1" w:uiPriority="39" w:unhideWhenUsed="1"/>
+    <w:lsdException w:name="toc 5" w:semiHidden="1" w:uiPriority="39" w:unhideWhenUsed="1"/>
+    <w:lsdException w:name="toc 6" w:semiHidden="1" w:uiPriority="39" w:unhideWhenUsed="1"/>
+    <w:lsdException w:name="toc 7" w:semiHidden="1" w:uiPriority="39" w:unhideWhenUsed="1"/>
+    <w:lsdException w:name="toc 8" w:semiHidden="1" w:uiPriority="39" w:unhideWhenUsed="1"/>
+    <w:lsdException w:name="toc 9" w:semiHidden="1" w:uiPriority="39" w:unhideWhenUsed="1"/>
     <w:lsdException w:name="Normal Indent" w:semiHidden="1" w:unhideWhenUsed="1"/>
     <w:lsdException w:name="footnote text" w:semiHidden="1" w:unhideWhenUsed="1"/>
     <w:lsdException w:name="annotation text" w:semiHidden="1" w:unhideWhenUsed="1"/>
     <w:lsdException w:name="header" w:semiHidden="1" w:unhideWhenUsed="1"/>
     <w:lsdException w:name="footer" w:semiHidden="1" w:unhideWhenUsed="1"/>
     <w:lsdException w:name="index heading" w:semiHidden="1" w:unhideWhenUsed="1"/>
-    <w:lsdException w:name="caption" w:uiPriority="35" w:semiHidden="1" w:unhideWhenUsed="1" w:qFormat="1"/>
+    <w:lsdException w:name="caption" w:semiHidden="1" w:uiPriority="35" w:unhideWhenUsed="1" w:qFormat="1"/>
     <w:lsdException w:name="table of figures" w:semiHidden="1" w:unhideWhenUsed="1"/>
     <w:lsdException w:name="envelope address" w:semiHidden="1" w:unhideWhenUsed="1"/>
     <w:lsdException w:name="envelope return" w:semiHidden="1" w:unhideWhenUsed="1"/>
@@ -1863,7 +1801,7 @@
     <w:lsdException w:name="Title" w:uiPriority="10" w:qFormat="1"/>
     <w:lsdException w:name="Closing" w:semiHidden="1" w:unhideWhenUsed="1"/>
     <w:lsdException w:name="Signature" w:semiHidden="1" w:unhideWhenUsed="1"/>
-    <w:lsdException w:name="Default Paragraph Font" w:uiPriority="1" w:semiHidden="1" w:unhideWhenUsed="1"/>
+    <w:lsdException w:name="Default Paragraph Font" w:semiHidden="1" w:uiPriority="1" w:unhideWhenUsed="1"/>
     <w:lsdException w:name="Body Text" w:semiHidden="1" w:unhideWhenUsed="1"/>
     <w:lsdException w:name="Body Text Indent" w:semiHidden="1" w:unhideWhenUsed="1"/>
     <w:lsdException w:name="List Continue" w:semiHidden="1" w:unhideWhenUsed="1"/>
@@ -2063,8 +2001,8 @@
     <w:lsdException w:name="Subtle Reference" w:uiPriority="31" w:qFormat="1"/>
     <w:lsdException w:name="Intense Reference" w:uiPriority="32" w:qFormat="1"/>
     <w:lsdException w:name="Book Title" w:uiPriority="33" w:qFormat="1"/>
-    <w:lsdException w:name="Bibliography" w:uiPriority="37" w:semiHidden="1" w:unhideWhenUsed="1"/>
-    <w:lsdException w:name="TOC Heading" w:uiPriority="39" w:semiHidden="1" w:unhideWhenUsed="1" w:qFormat="1"/>
+    <w:lsdException w:name="Bibliography" w:semiHidden="1" w:uiPriority="37" w:unhideWhenUsed="1"/>
+    <w:lsdException w:name="TOC Heading" w:semiHidden="1" w:uiPriority="39" w:unhideWhenUsed="1" w:qFormat="1"/>
     <w:lsdException w:name="Plain Table 1" w:uiPriority="41"/>
     <w:lsdException w:name="Plain Table 2" w:uiPriority="42"/>
     <w:lsdException w:name="Plain Table 3" w:uiPriority="43"/>
@@ -2175,24 +2113,16 @@
     <w:lsdException w:name="Unresolved Mention" w:semiHidden="1" w:unhideWhenUsed="1"/>
     <w:lsdException w:name="Smart Link" w:semiHidden="1" w:unhideWhenUsed="1"/>
   </w:latentStyles>
-  <w:style w:type="paragraph" w:styleId="Normal" w:default="1">
+  <w:style w:type="paragraph" w:default="1" w:styleId="Normal">
     <w:name w:val="Normal"/>
     <w:qFormat/>
     <w:pPr>
-      <w:widowControl/>
-      <w:suppressAutoHyphens w:val="true"/>
-      <w:bidi w:val="0"/>
-      <w:spacing w:lineRule="auto" w:line="247" w:before="0" w:after="136"/>
-      <w:ind w:hanging="10" w:left="10"/>
-      <w:jc w:val="left"/>
+      <w:spacing w:after="136" w:line="247" w:lineRule="auto"/>
+      <w:ind w:left="10" w:hanging="10"/>
     </w:pPr>
     <w:rPr>
-      <w:rFonts w:ascii="Cambria" w:hAnsi="Cambria" w:eastAsia="Cambria" w:cs="Cambria"/>
+      <w:rFonts w:ascii="Cambria" w:eastAsia="Cambria" w:hAnsi="Cambria" w:cs="Cambria"/>
       <w:color w:val="000000"/>
-      <w:kern w:val="0"/>
-      <w:sz w:val="22"/>
-      <w:szCs w:val="22"/>
-      <w:lang w:val="en-US" w:eastAsia="en-US" w:bidi="ar-SA"/>
     </w:rPr>
   </w:style>
   <w:style w:type="paragraph" w:styleId="Heading1">
@@ -2202,40 +2132,52 @@
     <w:uiPriority w:val="9"/>
     <w:qFormat/>
     <w:pPr>
-      <w:keepNext w:val="true"/>
+      <w:keepNext/>
       <w:keepLines/>
-      <w:widowControl/>
-      <w:suppressAutoHyphens w:val="true"/>
-      <w:bidi w:val="0"/>
-      <w:spacing w:lineRule="auto" w:line="259" w:before="0" w:after="63"/>
-      <w:ind w:hanging="10" w:left="10"/>
-      <w:jc w:val="left"/>
+      <w:spacing w:after="63" w:line="259" w:lineRule="auto"/>
+      <w:ind w:left="10" w:hanging="10"/>
       <w:outlineLvl w:val="0"/>
     </w:pPr>
     <w:rPr>
-      <w:rFonts w:ascii="Cambria" w:hAnsi="Cambria" w:eastAsia="Cambria" w:cs="Cambria"/>
+      <w:rFonts w:ascii="Cambria" w:eastAsia="Cambria" w:hAnsi="Cambria" w:cs="Cambria"/>
       <w:b/>
       <w:color w:val="000000"/>
-      <w:kern w:val="0"/>
-      <w:sz w:val="22"/>
-      <w:szCs w:val="22"/>
-      <w:lang w:val="en-US" w:eastAsia="en-US" w:bidi="ar-SA"/>
     </w:rPr>
   </w:style>
-  <w:style w:type="character" w:styleId="DefaultParagraphFont" w:default="1">
+  <w:style w:type="character" w:default="1" w:styleId="DefaultParagraphFont">
     <w:name w:val="Default Paragraph Font"/>
     <w:uiPriority w:val="1"/>
+    <w:semiHidden/>
     <w:unhideWhenUsed/>
-    <w:qFormat/>
-    <w:rPr/>
-  </w:style>
-  <w:style w:type="character" w:styleId="Heading1Char" w:customStyle="1">
+  </w:style>
+  <w:style w:type="table" w:default="1" w:styleId="TableNormal">
+    <w:name w:val="Normal Table"/>
+    <w:uiPriority w:val="99"/>
+    <w:semiHidden/>
+    <w:unhideWhenUsed/>
+    <w:tblPr>
+      <w:tblInd w:w="0" w:type="dxa"/>
+      <w:tblCellMar>
+        <w:top w:w="0" w:type="dxa"/>
+        <w:left w:w="108" w:type="dxa"/>
+        <w:bottom w:w="0" w:type="dxa"/>
+        <w:right w:w="108" w:type="dxa"/>
+      </w:tblCellMar>
+    </w:tblPr>
+  </w:style>
+  <w:style w:type="numbering" w:default="1" w:styleId="NoList">
+    <w:name w:val="No List"/>
+    <w:uiPriority w:val="99"/>
+    <w:semiHidden/>
+    <w:unhideWhenUsed/>
+  </w:style>
+  <w:style w:type="character" w:customStyle="1" w:styleId="Heading1Char">
     <w:name w:val="Heading 1 Char"/>
     <w:link w:val="Heading1"/>
     <w:uiPriority w:val="9"/>
     <w:qFormat/>
     <w:rPr>
-      <w:rFonts w:ascii="Cambria" w:hAnsi="Cambria" w:eastAsia="Cambria" w:cs="Cambria"/>
+      <w:rFonts w:ascii="Cambria" w:eastAsia="Cambria" w:hAnsi="Cambria" w:cs="Cambria"/>
       <w:b/>
       <w:color w:val="000000"/>
       <w:sz w:val="22"/>
@@ -2246,9 +2188,9 @@
     <w:basedOn w:val="DefaultParagraphFont"/>
     <w:uiPriority w:val="99"/>
     <w:unhideWhenUsed/>
-    <w:rsid w:val="00810d53"/>
+    <w:rsid w:val="00810D53"/>
     <w:rPr>
-      <w:color w:themeColor="hyperlink" w:val="0563C1"/>
+      <w:color w:val="0563C1" w:themeColor="hyperlink"/>
       <w:u w:val="single"/>
     </w:rPr>
   </w:style>
@@ -2258,7 +2200,7 @@
     <w:uiPriority w:val="99"/>
     <w:semiHidden/>
     <w:qFormat/>
-    <w:rsid w:val="005333f3"/>
+    <w:rsid w:val="005333F3"/>
     <w:rPr>
       <w:color w:val="808080"/>
     </w:rPr>
@@ -2270,37 +2212,37 @@
     <w:semiHidden/>
     <w:unhideWhenUsed/>
     <w:qFormat/>
-    <w:rsid w:val="00007dc5"/>
+    <w:rsid w:val="00007DC5"/>
     <w:rPr>
       <w:sz w:val="16"/>
       <w:szCs w:val="16"/>
     </w:rPr>
   </w:style>
-  <w:style w:type="character" w:styleId="CommentTextChar" w:customStyle="1">
+  <w:style w:type="character" w:customStyle="1" w:styleId="CommentTextChar">
     <w:name w:val="Comment Text Char"/>
     <w:basedOn w:val="DefaultParagraphFont"/>
     <w:link w:val="CommentText"/>
     <w:uiPriority w:val="99"/>
     <w:semiHidden/>
     <w:qFormat/>
-    <w:rsid w:val="00007dc5"/>
+    <w:rsid w:val="00007DC5"/>
     <w:rPr>
-      <w:rFonts w:ascii="Cambria" w:hAnsi="Cambria" w:eastAsia="Cambria" w:cs="Cambria"/>
+      <w:rFonts w:ascii="Cambria" w:eastAsia="Cambria" w:hAnsi="Cambria" w:cs="Cambria"/>
       <w:color w:val="000000"/>
       <w:sz w:val="20"/>
       <w:szCs w:val="20"/>
     </w:rPr>
   </w:style>
-  <w:style w:type="character" w:styleId="CommentSubjectChar" w:customStyle="1">
+  <w:style w:type="character" w:customStyle="1" w:styleId="CommentSubjectChar">
     <w:name w:val="Comment Subject Char"/>
     <w:basedOn w:val="CommentTextChar"/>
-    <w:link w:val="annotationsubject"/>
+    <w:link w:val="CommentSubject"/>
     <w:uiPriority w:val="99"/>
     <w:semiHidden/>
     <w:qFormat/>
-    <w:rsid w:val="00007dc5"/>
+    <w:rsid w:val="00007DC5"/>
     <w:rPr>
-      <w:rFonts w:ascii="Cambria" w:hAnsi="Cambria" w:eastAsia="Cambria" w:cs="Cambria"/>
+      <w:rFonts w:ascii="Cambria" w:eastAsia="Cambria" w:hAnsi="Cambria" w:cs="Cambria"/>
       <w:b/>
       <w:bCs/>
       <w:color w:val="000000"/>
@@ -2308,35 +2250,35 @@
       <w:szCs w:val="20"/>
     </w:rPr>
   </w:style>
-  <w:style w:type="character" w:styleId="FooterChar" w:customStyle="1">
+  <w:style w:type="character" w:customStyle="1" w:styleId="FooterChar">
     <w:name w:val="Footer Char"/>
     <w:basedOn w:val="DefaultParagraphFont"/>
     <w:link w:val="Footer"/>
     <w:uiPriority w:val="99"/>
     <w:qFormat/>
-    <w:rsid w:val="000a7d3c"/>
+    <w:rsid w:val="000A7D3C"/>
     <w:rPr>
       <w:rFonts w:cs="Times New Roman"/>
     </w:rPr>
   </w:style>
-  <w:style w:type="character" w:styleId="Bulletsuser">
+  <w:style w:type="character" w:customStyle="1" w:styleId="Bulletsuser">
     <w:name w:val="Bullets (user)"/>
     <w:qFormat/>
     <w:rPr>
-      <w:rFonts w:ascii="OpenSymbol" w:hAnsi="OpenSymbol" w:eastAsia="OpenSymbol" w:cs="OpenSymbol"/>
+      <w:rFonts w:ascii="OpenSymbol" w:eastAsia="OpenSymbol" w:hAnsi="OpenSymbol" w:cs="OpenSymbol"/>
     </w:rPr>
   </w:style>
-  <w:style w:type="paragraph" w:styleId="Heading">
+  <w:style w:type="paragraph" w:customStyle="1" w:styleId="Heading">
     <w:name w:val="Heading"/>
     <w:basedOn w:val="Normal"/>
     <w:next w:val="BodyText"/>
     <w:qFormat/>
     <w:pPr>
-      <w:keepNext w:val="true"/>
+      <w:keepNext/>
       <w:spacing w:before="240" w:after="120"/>
     </w:pPr>
     <w:rPr>
-      <w:rFonts w:ascii="Liberation Sans" w:hAnsi="Liberation Sans" w:eastAsia="Noto Sans CJK SC" w:cs="Noto Sans Devanagari"/>
+      <w:rFonts w:ascii="Liberation Sans" w:eastAsia="Noto Sans CJK SC" w:hAnsi="Liberation Sans" w:cs="Noto Sans Devanagari"/>
       <w:sz w:val="28"/>
       <w:szCs w:val="28"/>
     </w:rPr>
@@ -2345,14 +2287,12 @@
     <w:name w:val="Body Text"/>
     <w:basedOn w:val="Normal"/>
     <w:pPr>
-      <w:spacing w:lineRule="auto" w:line="276" w:before="0" w:after="140"/>
+      <w:spacing w:after="140" w:line="276" w:lineRule="auto"/>
     </w:pPr>
-    <w:rPr/>
   </w:style>
   <w:style w:type="paragraph" w:styleId="List">
     <w:name w:val="List"/>
     <w:basedOn w:val="BodyText"/>
-    <w:pPr/>
     <w:rPr>
       <w:rFonts w:cs="Noto Sans Devanagari"/>
     </w:rPr>
@@ -2364,19 +2304,19 @@
     <w:uiPriority w:val="35"/>
     <w:unhideWhenUsed/>
     <w:qFormat/>
-    <w:rsid w:val="008354dd"/>
+    <w:rsid w:val="008354DD"/>
     <w:pPr>
-      <w:spacing w:lineRule="auto" w:line="240" w:before="0" w:after="200"/>
+      <w:spacing w:after="200" w:line="240" w:lineRule="auto"/>
     </w:pPr>
     <w:rPr>
       <w:i/>
       <w:iCs/>
-      <w:color w:themeColor="text2" w:val="44546A"/>
+      <w:color w:val="44546A" w:themeColor="text2"/>
       <w:sz w:val="18"/>
       <w:szCs w:val="18"/>
     </w:rPr>
   </w:style>
-  <w:style w:type="paragraph" w:styleId="Index">
+  <w:style w:type="paragraph" w:customStyle="1" w:styleId="Index">
     <w:name w:val="Index"/>
     <w:basedOn w:val="Normal"/>
     <w:qFormat/>
@@ -2392,34 +2332,21 @@
     <w:basedOn w:val="Normal"/>
     <w:uiPriority w:val="34"/>
     <w:qFormat/>
-    <w:rsid w:val="00150ac6"/>
+    <w:rsid w:val="00150AC6"/>
     <w:pPr>
-      <w:spacing w:before="0" w:after="136"/>
       <w:ind w:left="720"/>
       <w:contextualSpacing/>
     </w:pPr>
-    <w:rPr/>
   </w:style>
   <w:style w:type="paragraph" w:styleId="Revision">
     <w:name w:val="Revision"/>
     <w:uiPriority w:val="99"/>
     <w:semiHidden/>
     <w:qFormat/>
-    <w:rsid w:val="00185db5"/>
-    <w:pPr>
-      <w:widowControl/>
-      <w:suppressAutoHyphens w:val="true"/>
-      <w:bidi w:val="0"/>
-      <w:spacing w:lineRule="auto" w:line="240" w:before="0" w:after="0"/>
-      <w:jc w:val="left"/>
-    </w:pPr>
+    <w:rsid w:val="00185DB5"/>
     <w:rPr>
-      <w:rFonts w:ascii="Cambria" w:hAnsi="Cambria" w:eastAsia="Cambria" w:cs="Cambria"/>
+      <w:rFonts w:ascii="Cambria" w:eastAsia="Cambria" w:hAnsi="Cambria" w:cs="Cambria"/>
       <w:color w:val="000000"/>
-      <w:kern w:val="0"/>
-      <w:sz w:val="22"/>
-      <w:szCs w:val="22"/>
-      <w:lang w:val="en-US" w:eastAsia="en-US" w:bidi="ar-SA"/>
     </w:rPr>
   </w:style>
   <w:style w:type="paragraph" w:styleId="CommentText">
@@ -2429,16 +2356,16 @@
     <w:uiPriority w:val="99"/>
     <w:semiHidden/>
     <w:unhideWhenUsed/>
-    <w:rsid w:val="00007dc5"/>
+    <w:rsid w:val="00007DC5"/>
     <w:pPr>
-      <w:spacing w:lineRule="auto" w:line="240"/>
+      <w:spacing w:line="240" w:lineRule="auto"/>
     </w:pPr>
     <w:rPr>
       <w:sz w:val="20"/>
       <w:szCs w:val="20"/>
     </w:rPr>
   </w:style>
-  <w:style w:type="paragraph" w:styleId="annotationsubject">
+  <w:style w:type="paragraph" w:styleId="CommentSubject">
     <w:name w:val="annotation subject"/>
     <w:basedOn w:val="CommentText"/>
     <w:next w:val="CommentText"/>
@@ -2447,19 +2374,16 @@
     <w:semiHidden/>
     <w:unhideWhenUsed/>
     <w:qFormat/>
-    <w:rsid w:val="00007dc5"/>
-    <w:pPr/>
+    <w:rsid w:val="00007DC5"/>
     <w:rPr>
       <w:b/>
       <w:bCs/>
     </w:rPr>
   </w:style>
-  <w:style w:type="paragraph" w:styleId="HeaderandFooter">
+  <w:style w:type="paragraph" w:customStyle="1" w:styleId="HeaderandFooter">
     <w:name w:val="Header and Footer"/>
     <w:basedOn w:val="Normal"/>
     <w:qFormat/>
-    <w:pPr/>
-    <w:rPr/>
   </w:style>
   <w:style w:type="paragraph" w:styleId="Footer">
     <w:name w:val="footer"/>
@@ -2467,64 +2391,37 @@
     <w:link w:val="FooterChar"/>
     <w:uiPriority w:val="99"/>
     <w:unhideWhenUsed/>
-    <w:rsid w:val="000a7d3c"/>
+    <w:rsid w:val="000A7D3C"/>
     <w:pPr>
       <w:tabs>
-        <w:tab w:val="clear" w:pos="720"/>
-        <w:tab w:val="center" w:pos="4680" w:leader="none"/>
-        <w:tab w:val="right" w:pos="9360" w:leader="none"/>
+        <w:tab w:val="center" w:pos="4680"/>
+        <w:tab w:val="right" w:pos="9360"/>
       </w:tabs>
-      <w:spacing w:lineRule="auto" w:line="240" w:before="0" w:after="0"/>
-      <w:ind w:hanging="0" w:left="0"/>
+      <w:spacing w:after="0" w:line="240" w:lineRule="auto"/>
+      <w:ind w:left="0" w:firstLine="0"/>
     </w:pPr>
     <w:rPr>
-      <w:rFonts w:ascii="Calibri" w:hAnsi="Calibri" w:eastAsia="" w:cs="Times New Roman" w:asciiTheme="minorHAnsi" w:eastAsiaTheme="minorEastAsia" w:hAnsiTheme="minorHAnsi"/>
+      <w:rFonts w:asciiTheme="minorHAnsi" w:eastAsiaTheme="minorEastAsia" w:hAnsiTheme="minorHAnsi" w:cs="Times New Roman"/>
       <w:color w:val="auto"/>
     </w:rPr>
   </w:style>
   <w:style w:type="paragraph" w:styleId="Header">
     <w:name w:val="header"/>
     <w:basedOn w:val="HeaderandFooter"/>
-    <w:pPr/>
-    <w:rPr/>
-  </w:style>
-  <w:style w:type="numbering" w:styleId="NoList" w:default="1">
-    <w:name w:val="No List"/>
-    <w:uiPriority w:val="99"/>
-    <w:semiHidden/>
-    <w:unhideWhenUsed/>
-    <w:qFormat/>
-  </w:style>
-  <w:style w:type="table" w:default="1" w:styleId="TableNormal">
-    <w:name w:val="Normal Table"/>
-    <w:uiPriority w:val="99"/>
-    <w:semiHidden/>
-    <w:unhideWhenUsed/>
-    <w:tblPr>
-      <w:tblCellMar>
-        <w:top w:w="0" w:type="dxa"/>
-        <w:left w:w="108" w:type="dxa"/>
-        <w:bottom w:w="0" w:type="dxa"/>
-        <w:right w:w="108" w:type="dxa"/>
-      </w:tblCellMar>
-    </w:tblPr>
   </w:style>
   <w:style w:type="table" w:styleId="TableGrid">
     <w:name w:val="Table Grid"/>
     <w:basedOn w:val="TableNormal"/>
     <w:uiPriority w:val="39"/>
-    <w:rsid w:val="005333f3"/>
-    <w:pPr>
-      <w:spacing w:after="0" w:line="240" w:lineRule="auto"/>
-    </w:pPr>
+    <w:rsid w:val="005333F3"/>
     <w:tblPr>
       <w:tblBorders>
-        <w:top w:val="single" w:color="auto" w:sz="4" w:space="0"/>
-        <w:left w:val="single" w:color="auto" w:sz="4" w:space="0"/>
-        <w:bottom w:val="single" w:color="auto" w:sz="4" w:space="0"/>
-        <w:right w:val="single" w:color="auto" w:sz="4" w:space="0"/>
-        <w:insideH w:val="single" w:color="auto" w:sz="4" w:space="0"/>
-        <w:insideV w:val="single" w:color="auto" w:sz="4" w:space="0"/>
+        <w:top w:val="single" w:sz="4" w:space="0" w:color="auto"/>
+        <w:left w:val="single" w:sz="4" w:space="0" w:color="auto"/>
+        <w:bottom w:val="single" w:sz="4" w:space="0" w:color="auto"/>
+        <w:right w:val="single" w:sz="4" w:space="0" w:color="auto"/>
+        <w:insideH w:val="single" w:sz="4" w:space="0" w:color="auto"/>
+        <w:insideV w:val="single" w:sz="4" w:space="0" w:color="auto"/>
       </w:tblBorders>
     </w:tblPr>
   </w:style>
@@ -2532,10 +2429,7 @@
     <w:name w:val="Plain Table 3"/>
     <w:basedOn w:val="TableNormal"/>
     <w:uiPriority w:val="43"/>
-    <w:rsid w:val="005333f3"/>
-    <w:pPr>
-      <w:spacing w:after="0" w:line="240" w:lineRule="auto"/>
-    </w:pPr>
+    <w:rsid w:val="005333F3"/>
     <w:tblPr>
       <w:tblStyleRowBandSize w:val="1"/>
       <w:tblStyleColBandSize w:val="1"/>
@@ -2549,7 +2443,7 @@
       <w:tblPr/>
       <w:tcPr>
         <w:tcBorders>
-          <w:bottom w:val="single" w:color="7F7F7F" w:themeColor="text1" w:sz="4" w:space="0"/>
+          <w:bottom w:val="single" w:sz="4" w:space="0" w:color="000000" w:themeColor="text1"/>
         </w:tcBorders>
       </w:tcPr>
     </w:tblStylePr>
@@ -2575,7 +2469,7 @@
       <w:tblPr/>
       <w:tcPr>
         <w:tcBorders>
-          <w:right w:val="single" w:color="7F7F7F" w:themeColor="text1" w:sz="4" w:space="0"/>
+          <w:right w:val="single" w:sz="4" w:space="0" w:color="000000" w:themeColor="text1"/>
         </w:tcBorders>
       </w:tcPr>
     </w:tblStylePr>
@@ -2595,13 +2489,13 @@
     <w:tblStylePr w:type="band1Vert">
       <w:tblPr/>
       <w:tcPr>
-        <w:shd w:val="clear" w:color="auto" w:fill="F2F2F2" w:themeFill="background1" w:themeFillShade="f2"/>
+        <w:shd w:val="clear" w:color="auto" w:fill="F2F2F2" w:themeFill="background1" w:themeFillShade="F2"/>
       </w:tcPr>
     </w:tblStylePr>
     <w:tblStylePr w:type="band1Horz">
       <w:tblPr/>
       <w:tcPr>
-        <w:shd w:val="clear" w:color="auto" w:fill="F2F2F2" w:themeFill="background1" w:themeFillShade="f2"/>
+        <w:shd w:val="clear" w:color="auto" w:fill="F2F2F2" w:themeFill="background1" w:themeFillShade="F2"/>
       </w:tcPr>
     </w:tblStylePr>
     <w:tblStylePr w:type="neCell">
@@ -2625,20 +2519,17 @@
     <w:name w:val="Grid Table 1 Light"/>
     <w:basedOn w:val="TableNormal"/>
     <w:uiPriority w:val="46"/>
-    <w:rsid w:val="005333f3"/>
-    <w:pPr>
-      <w:spacing w:after="0" w:line="240" w:lineRule="auto"/>
-    </w:pPr>
+    <w:rsid w:val="005333F3"/>
     <w:tblPr>
       <w:tblStyleRowBandSize w:val="1"/>
       <w:tblStyleColBandSize w:val="1"/>
       <w:tblBorders>
-        <w:top w:val="single" w:color="999999" w:themeColor="text1" w:themeTint="66" w:sz="4" w:space="0"/>
-        <w:left w:val="single" w:color="999999" w:themeColor="text1" w:themeTint="66" w:sz="4" w:space="0"/>
-        <w:bottom w:val="single" w:color="999999" w:themeColor="text1" w:themeTint="66" w:sz="4" w:space="0"/>
-        <w:right w:val="single" w:color="999999" w:themeColor="text1" w:themeTint="66" w:sz="4" w:space="0"/>
-        <w:insideH w:val="single" w:color="999999" w:themeColor="text1" w:themeTint="66" w:sz="4" w:space="0"/>
-        <w:insideV w:val="single" w:color="999999" w:themeColor="text1" w:themeTint="66" w:sz="4" w:space="0"/>
+        <w:top w:val="single" w:sz="4" w:space="0" w:color="999999" w:themeColor="text1" w:themeTint="66"/>
+        <w:left w:val="single" w:sz="4" w:space="0" w:color="999999" w:themeColor="text1" w:themeTint="66"/>
+        <w:bottom w:val="single" w:sz="4" w:space="0" w:color="999999" w:themeColor="text1" w:themeTint="66"/>
+        <w:right w:val="single" w:sz="4" w:space="0" w:color="999999" w:themeColor="text1" w:themeTint="66"/>
+        <w:insideH w:val="single" w:sz="4" w:space="0" w:color="999999" w:themeColor="text1" w:themeTint="66"/>
+        <w:insideV w:val="single" w:sz="4" w:space="0" w:color="999999" w:themeColor="text1" w:themeTint="66"/>
       </w:tblBorders>
     </w:tblPr>
     <w:tblStylePr w:type="firstRow">
@@ -2649,7 +2540,7 @@
       <w:tblPr/>
       <w:tcPr>
         <w:tcBorders>
-          <w:bottom w:val="single" w:color="666666" w:themeColor="text1" w:sz="12" w:space="0"/>
+          <w:bottom w:val="single" w:sz="12" w:space="0" w:color="000000" w:themeColor="text1"/>
         </w:tcBorders>
       </w:tcPr>
     </w:tblStylePr>
@@ -2661,7 +2552,7 @@
       <w:tblPr/>
       <w:tcPr>
         <w:tcBorders>
-          <w:top w:val="double" w:color="666666" w:themeColor="text1" w:sz="2" w:space="0"/>
+          <w:top w:val="double" w:sz="2" w:space="0" w:color="000000" w:themeColor="text1"/>
         </w:tcBorders>
       </w:tcPr>
     </w:tblStylePr>
@@ -2670,32 +2561,27 @@
         <w:b/>
         <w:bCs/>
       </w:rPr>
-      <w:tblPr/>
     </w:tblStylePr>
     <w:tblStylePr w:type="lastCol">
       <w:rPr>
         <w:b/>
         <w:bCs/>
       </w:rPr>
-      <w:tblPr/>
     </w:tblStylePr>
   </w:style>
   <w:style w:type="table" w:styleId="GridTable2">
     <w:name w:val="Grid Table 2"/>
     <w:basedOn w:val="TableNormal"/>
     <w:uiPriority w:val="47"/>
-    <w:rsid w:val="005333f3"/>
-    <w:pPr>
-      <w:spacing w:after="0" w:line="240" w:lineRule="auto"/>
-    </w:pPr>
+    <w:rsid w:val="005333F3"/>
     <w:tblPr>
       <w:tblStyleRowBandSize w:val="1"/>
       <w:tblStyleColBandSize w:val="1"/>
       <w:tblBorders>
-        <w:top w:val="single" w:color="666666" w:themeColor="text1" w:themeTint="99" w:sz="2" w:space="0"/>
-        <w:bottom w:val="single" w:color="666666" w:themeColor="text1" w:themeTint="99" w:sz="2" w:space="0"/>
-        <w:insideH w:val="single" w:color="666666" w:themeColor="text1" w:themeTint="99" w:sz="2" w:space="0"/>
-        <w:insideV w:val="single" w:color="666666" w:themeColor="text1" w:themeTint="99" w:sz="2" w:space="0"/>
+        <w:top w:val="single" w:sz="2" w:space="0" w:color="666666" w:themeColor="text1" w:themeTint="99"/>
+        <w:bottom w:val="single" w:sz="2" w:space="0" w:color="666666" w:themeColor="text1" w:themeTint="99"/>
+        <w:insideH w:val="single" w:sz="2" w:space="0" w:color="666666" w:themeColor="text1" w:themeTint="99"/>
+        <w:insideV w:val="single" w:sz="2" w:space="0" w:color="666666" w:themeColor="text1" w:themeTint="99"/>
       </w:tblBorders>
     </w:tblPr>
     <w:tblStylePr w:type="firstRow">
@@ -2707,7 +2593,7 @@
       <w:tcPr>
         <w:tcBorders>
           <w:top w:val="nil"/>
-          <w:bottom w:val="single" w:color="666666" w:themeColor="text1" w:sz="12" w:space="0"/>
+          <w:bottom w:val="single" w:sz="12" w:space="0" w:color="000000" w:themeColor="text1"/>
           <w:insideH w:val="nil"/>
           <w:insideV w:val="nil"/>
         </w:tcBorders>
@@ -2722,7 +2608,7 @@
       <w:tblPr/>
       <w:tcPr>
         <w:tcBorders>
-          <w:top w:val="double" w:color="666666" w:themeColor="text1" w:sz="2" w:space="0"/>
+          <w:top w:val="double" w:sz="2" w:space="0" w:color="000000" w:themeColor="text1"/>
           <w:bottom w:val="nil"/>
           <w:insideH w:val="nil"/>
           <w:insideV w:val="nil"/>
@@ -2735,14 +2621,12 @@
         <w:b/>
         <w:bCs/>
       </w:rPr>
-      <w:tblPr/>
     </w:tblStylePr>
     <w:tblStylePr w:type="lastCol">
       <w:rPr>
         <w:b/>
         <w:bCs/>
       </w:rPr>
-      <w:tblPr/>
     </w:tblStylePr>
     <w:tblStylePr w:type="band1Vert">
       <w:tblPr/>
@@ -2761,20 +2645,17 @@
     <w:name w:val="Plain Table 1"/>
     <w:basedOn w:val="TableNormal"/>
     <w:uiPriority w:val="41"/>
-    <w:rsid w:val="00e8723f"/>
-    <w:pPr>
-      <w:spacing w:after="0" w:line="240" w:lineRule="auto"/>
-    </w:pPr>
+    <w:rsid w:val="00E8723F"/>
     <w:tblPr>
       <w:tblStyleRowBandSize w:val="1"/>
       <w:tblStyleColBandSize w:val="1"/>
       <w:tblBorders>
-        <w:top w:val="single" w:color="BFBFBF" w:themeColor="background1" w:sz="4" w:space="0"/>
-        <w:left w:val="single" w:color="BFBFBF" w:themeColor="background1" w:sz="4" w:space="0"/>
-        <w:bottom w:val="single" w:color="BFBFBF" w:themeColor="background1" w:sz="4" w:space="0"/>
-        <w:right w:val="single" w:color="BFBFBF" w:themeColor="background1" w:sz="4" w:space="0"/>
-        <w:insideH w:val="single" w:color="BFBFBF" w:themeColor="background1" w:sz="4" w:space="0"/>
-        <w:insideV w:val="single" w:color="BFBFBF" w:themeColor="background1" w:sz="4" w:space="0"/>
+        <w:top w:val="single" w:sz="4" w:space="0" w:color="FFFFFF" w:themeColor="background1"/>
+        <w:left w:val="single" w:sz="4" w:space="0" w:color="FFFFFF" w:themeColor="background1"/>
+        <w:bottom w:val="single" w:sz="4" w:space="0" w:color="FFFFFF" w:themeColor="background1"/>
+        <w:right w:val="single" w:sz="4" w:space="0" w:color="FFFFFF" w:themeColor="background1"/>
+        <w:insideH w:val="single" w:sz="4" w:space="0" w:color="FFFFFF" w:themeColor="background1"/>
+        <w:insideV w:val="single" w:sz="4" w:space="0" w:color="FFFFFF" w:themeColor="background1"/>
       </w:tblBorders>
     </w:tblPr>
     <w:tblStylePr w:type="firstRow">
@@ -2782,7 +2663,6 @@
         <w:b/>
         <w:bCs/>
       </w:rPr>
-      <w:tblPr/>
     </w:tblStylePr>
     <w:tblStylePr w:type="lastRow">
       <w:rPr>
@@ -2792,7 +2672,7 @@
       <w:tblPr/>
       <w:tcPr>
         <w:tcBorders>
-          <w:top w:val="double" w:color="BFBFBF" w:themeColor="background1" w:sz="4" w:space="0"/>
+          <w:top w:val="double" w:sz="4" w:space="0" w:color="FFFFFF" w:themeColor="background1"/>
         </w:tcBorders>
       </w:tcPr>
     </w:tblStylePr>
@@ -2801,25 +2681,23 @@
         <w:b/>
         <w:bCs/>
       </w:rPr>
-      <w:tblPr/>
     </w:tblStylePr>
     <w:tblStylePr w:type="lastCol">
       <w:rPr>
         <w:b/>
         <w:bCs/>
       </w:rPr>
-      <w:tblPr/>
     </w:tblStylePr>
     <w:tblStylePr w:type="band1Vert">
       <w:tblPr/>
       <w:tcPr>
-        <w:shd w:val="clear" w:color="auto" w:fill="F2F2F2" w:themeFill="background1" w:themeFillShade="f2"/>
+        <w:shd w:val="clear" w:color="auto" w:fill="F2F2F2" w:themeFill="background1" w:themeFillShade="F2"/>
       </w:tcPr>
     </w:tblStylePr>
     <w:tblStylePr w:type="band1Horz">
       <w:tblPr/>
       <w:tcPr>
-        <w:shd w:val="clear" w:color="auto" w:fill="F2F2F2" w:themeFill="background1" w:themeFillShade="f2"/>
+        <w:shd w:val="clear" w:color="auto" w:fill="F2F2F2" w:themeFill="background1" w:themeFillShade="F2"/>
       </w:tcPr>
     </w:tblStylePr>
   </w:style>
@@ -2827,54 +2705,54 @@
 </file>
 
 <file path=word/theme/theme1.xml><?xml version="1.0" encoding="utf-8"?>
-<a:theme xmlns:a="http://schemas.openxmlformats.org/drawingml/2006/main" xmlns:r="http://schemas.openxmlformats.org/officeDocument/2006/relationships" name="Office Theme">
+<a:theme xmlns:a="http://schemas.openxmlformats.org/drawingml/2006/main" name="Office Theme">
   <a:themeElements>
     <a:clrScheme name="Office">
       <a:dk1>
         <a:srgbClr val="000000"/>
       </a:dk1>
       <a:lt1>
-        <a:srgbClr val="ffffff"/>
+        <a:srgbClr val="FFFFFF"/>
       </a:lt1>
       <a:dk2>
-        <a:srgbClr val="44546a"/>
+        <a:srgbClr val="44546A"/>
       </a:dk2>
       <a:lt2>
-        <a:srgbClr val="e7e6e6"/>
+        <a:srgbClr val="E7E6E6"/>
       </a:lt2>
       <a:accent1>
-        <a:srgbClr val="4472c4"/>
+        <a:srgbClr val="4472C4"/>
       </a:accent1>
       <a:accent2>
-        <a:srgbClr val="ed7d31"/>
+        <a:srgbClr val="ED7D31"/>
       </a:accent2>
       <a:accent3>
-        <a:srgbClr val="a5a5a5"/>
+        <a:srgbClr val="A5A5A5"/>
       </a:accent3>
       <a:accent4>
-        <a:srgbClr val="ffc000"/>
+        <a:srgbClr val="FFC000"/>
       </a:accent4>
       <a:accent5>
-        <a:srgbClr val="5b9bd5"/>
+        <a:srgbClr val="5B9BD5"/>
       </a:accent5>
       <a:accent6>
-        <a:srgbClr val="70ad47"/>
+        <a:srgbClr val="70AD47"/>
       </a:accent6>
       <a:hlink>
-        <a:srgbClr val="0563c1"/>
+        <a:srgbClr val="0563C1"/>
       </a:hlink>
       <a:folHlink>
-        <a:srgbClr val="954f72"/>
+        <a:srgbClr val="954F72"/>
       </a:folHlink>
     </a:clrScheme>
     <a:fontScheme name="Office">
       <a:majorFont>
-        <a:latin typeface="Calibri Light" panose="020F0302020204030204" pitchFamily="0" charset="1"/>
+        <a:latin typeface="Calibri Light" panose="020F0302020204030204"/>
         <a:ea typeface=""/>
         <a:cs typeface=""/>
       </a:majorFont>
       <a:minorFont>
-        <a:latin typeface="Calibri" panose="020F0502020204030204" pitchFamily="0" charset="1"/>
+        <a:latin typeface="Calibri" panose="020F0502020204030204"/>
         <a:ea typeface=""/>
         <a:cs typeface=""/>
       </a:minorFont>
@@ -2906,7 +2784,7 @@
             </a:gs>
           </a:gsLst>
           <a:lin ang="5400000" scaled="0"/>
-          <a:tileRect l="0" t="0" r="0" b="0"/>
+          <a:tileRect/>
         </a:gradFill>
         <a:gradFill>
           <a:gsLst>
@@ -2930,7 +2808,7 @@
             </a:gs>
           </a:gsLst>
           <a:lin ang="5400000" scaled="0"/>
-          <a:tileRect l="0" t="0" r="0" b="0"/>
+          <a:tileRect/>
         </a:gradFill>
       </a:fillStyleLst>
       <a:lnStyleLst>
@@ -2990,11 +2868,13 @@
             </a:gs>
           </a:gsLst>
           <a:lin ang="5400000" scaled="0"/>
-          <a:tileRect l="0" t="0" r="0" b="0"/>
+          <a:tileRect/>
         </a:gradFill>
       </a:bgFillStyleLst>
     </a:fmtScheme>
   </a:themeElements>
+  <a:objectDefaults/>
+  <a:extraClrSchemeLst/>
 </a:theme>
 </file>
 

</xml_diff>